<commit_message>
Merging from home pc
</commit_message>
<xml_diff>
--- a/Workshops/Workshop 7 - LM with multiple predictors/Workshop-7---LM-with-multiple-predictors--with-answers-.docx
+++ b/Workshops/Workshop 7 - LM with multiple predictors/Workshop-7---LM-with-multiple-predictors--with-answers-.docx
@@ -95,7 +95,7 @@
         <w:t xml:space="preserve"> </w:t>
       </w:r>
       <w:r>
-        <w:t xml:space="preserve">2024-10-03</w:t>
+        <w:t xml:space="preserve">2024-10-13</w:t>
       </w:r>
     </w:p>
     <w:sdt>
@@ -2556,7 +2556,7 @@
         <w:rPr>
           <w:rStyle w:val="CommentTok"/>
         </w:rPr>
-        <w:t xml:space="preserve"># Our confidence intervals will be artificially inflated, making our predictions look more uncertain than they should be.</w:t>
+        <w:t xml:space="preserve"># Our confidence intervals will either be artificially inflated or deflated (i.e. either too small or too big), making our predictions look more or less uncertain than they should be.</w:t>
       </w:r>
     </w:p>
     <w:p>
@@ -5049,13 +5049,13 @@
         <w:t xml:space="preserve">()</w:t>
       </w:r>
     </w:p>
-    <w:bookmarkStart w:id="57" w:name="question-set-five"/>
+    <w:bookmarkStart w:id="57" w:name="question-set-two"/>
     <w:p>
       <w:pPr>
         <w:pStyle w:val="Heading3"/>
       </w:pPr>
       <w:r>
-        <w:t xml:space="preserve">Question Set Five</w:t>
+        <w:t xml:space="preserve">Question Set Two</w:t>
       </w:r>
     </w:p>
     <w:p>
@@ -8895,7 +8895,7 @@
         <w:rPr>
           <w:rStyle w:val="CommentTok"/>
         </w:rPr>
-        <w:t xml:space="preserve"># This is the same DAG as above. Nothing actually changes in the DAG even though our reseasrch question has.</w:t>
+        <w:t xml:space="preserve"># This is the same DAG as above. Nothing actually changes in the DAG even though our research question has.</w:t>
       </w:r>
       <w:r>
         <w:br/>

</xml_diff>

<commit_message>
Updated data for 2025
</commit_message>
<xml_diff>
--- a/Workshops/Workshop 7 - LM with multiple predictors/Workshop-7---LM-with-multiple-predictors--with-answers-.docx
+++ b/Workshops/Workshop 7 - LM with multiple predictors/Workshop-7---LM-with-multiple-predictors--with-answers-.docx
@@ -95,7 +95,7 @@
         <w:t xml:space="preserve"> </w:t>
       </w:r>
       <w:r>
-        <w:t xml:space="preserve">2024-10-13</w:t>
+        <w:t xml:space="preserve">2025-05-15</w:t>
       </w:r>
     </w:p>
     <w:sdt>
@@ -239,7 +239,7 @@
         <w:pStyle w:val="FirstParagraph"/>
       </w:pPr>
       <w:r>
-        <w:t xml:space="preserve">Today, we’re going to explore two different approaches to modelling using the same dataset with both models being fit using a linear model. You might recognize this dataset from the first week of the course — it contains information about rental prices in Aberdeen.</w:t>
+        <w:t xml:space="preserve">Today, we’re going to explore two different approaches to modelling using the same dataset with both models being fit using a linear model. You might recognize this dataset from the first week of the course — it contains information about rental Prices in Aberdeen.</w:t>
       </w:r>
     </w:p>
     <w:p>
@@ -269,7 +269,7 @@
         <w:t xml:space="preserve"> </w:t>
       </w:r>
       <w:r>
-        <w:t xml:space="preserve">aimed at predicting rent prices as accurately as possible.</w:t>
+        <w:t xml:space="preserve">aimed at predicting rent Prices as accurately as possible.</w:t>
       </w:r>
     </w:p>
     <w:p>
@@ -291,7 +291,7 @@
         <w:t xml:space="preserve"> </w:t>
       </w:r>
       <w:r>
-        <w:t xml:space="preserve">designed to understand the effect of square meters on rent price.</w:t>
+        <w:t xml:space="preserve">designed to understand the effect of square meters on rent Price.</w:t>
       </w:r>
     </w:p>
     <w:p>
@@ -353,7 +353,7 @@
         <w:pStyle w:val="FirstParagraph"/>
       </w:pPr>
       <w:r>
-        <w:t xml:space="preserve">This one’s simple: We just want to predict rent price. We’re not interested in why a rented property (either a flat or house) is more or less expensive; we just want to predict the listed price as accurately as possible.</w:t>
+        <w:t xml:space="preserve">This one’s simple: We just want to predict rent Price. We’re not interested in why a rented property (either a flat or house) is more or less expensive; we just want to predict the listed Price as accurately as possible.</w:t>
       </w:r>
     </w:p>
     <w:bookmarkEnd w:id="22"/>
@@ -379,7 +379,7 @@
         <w:pStyle w:val="BodyText"/>
       </w:pPr>
       <w:r>
-        <w:t xml:space="preserve">As a warning, there are properties that when listed were given a specific price but by the time you look at a particular link, it may have had it’s priced reduced. For example, there is one property that when I first added it to the dataset was listed at a whopping £3,200 a month but at the time of writing this, that price had dropped to £2,900 (because no one was willing to pay £3.2k in rent). In these cases, you’ll need to decide for yourself how you want to deal with these. Your options are; 1) retain the original price if you think it wasn’t a data entry mistake, 2) update the price with the newly lowered rent, or 3) create an entirely new observation for this</w:t>
+        <w:t xml:space="preserve">As a warning, there are properties that when listed were given a specific Price but by the time you look at a particular link, it may have had it’s Priced reduced. For example, there is one property that when I first added it to the dataset was listed at a whopping £3,200 a month but at the time of writing this, that Price had dropped to £2,900 (because no one was willing to pay £3.2k in rent). In these cases, you’ll need to decide for yourself how you want to deal with these. Your options are; 1) retain the original Price if you think it wasn’t a data entry mistake, 2) update the Price with the newly lowered rent, or 3) create an entirely new observation for this</w:t>
       </w:r>
       <w:r>
         <w:t xml:space="preserve"> </w:t>
@@ -397,7 +397,7 @@
         <w:t xml:space="preserve"> </w:t>
       </w:r>
       <w:r>
-        <w:t xml:space="preserve">listing. Note that option 3) will lead to an assumption being violated. Do you know which assumption would be broken if creating a new observation for any properties that had their price lowered?</w:t>
+        <w:t xml:space="preserve">listing. Note that option 3) will lead to an assumption being violated. Do you know which assumption would be broken if creating a new observation for any properties that had their Price lowered?</w:t>
       </w:r>
     </w:p>
     <w:bookmarkEnd w:id="23"/>
@@ -415,7 +415,7 @@
         <w:pStyle w:val="FirstParagraph"/>
       </w:pPr>
       <w:r>
-        <w:t xml:space="preserve">Even in a predictive model, we need to think about potential hidden assumptions. If our data is flawed or not representative, our predictions will be flawed too. Take a moment to consider limitations. For example, can we use this model to predict rent prices in London?</w:t>
+        <w:t xml:space="preserve">Even in a predictive model, we need to think about potential hidden assumptions. If our data is flawed or not representative, our predictions will be flawed too. Take a moment to consider limitations. For example, can we use this model to predict rent Prices in London?</w:t>
       </w:r>
     </w:p>
     <w:p>
@@ -423,7 +423,7 @@
         <w:pStyle w:val="BodyText"/>
       </w:pPr>
       <w:r>
-        <w:t xml:space="preserve">Another hidden aspect of the data that you may want to consider (and potentially resolve if you are unhappy with it), is that the data contains both rental prices for both houses and flats, with no distinction made between them. Unless you decide to go through all</w:t>
+        <w:t xml:space="preserve">Another hidden aspect of the data that you may want to consider (and potentially resolve if you are unhappy with it), is that the data contains both rental Prices for both houses and flats, with no distinction made between them. Unless you decide to go through all</w:t>
       </w:r>
       <w:r>
         <w:t xml:space="preserve"> </w:t>
@@ -461,7 +461,7 @@
         <w:rPr>
           <w:rStyle w:val="CommentTok"/>
         </w:rPr>
-        <w:t xml:space="preserve"># The other issue is that this will likely create some unequal variance of errors, with predictions being worse (i.e. less accurate, i.e. more residual error) at higher predicted rent prices (as most houses cost more to rent, the model will likely struggle to understand *why* they are so expensive [or cheap], leading to more error).</w:t>
+        <w:t xml:space="preserve"># The other issue is that this will likely create some unequal variance of errors, with predictions being worse (i.e. less accurate, i.e. more residual error) at higher predicted rent Prices (as most houses cost more to rent, the model will likely struggle to understand *why* they are so expensive [or cheap], leading to more error).</w:t>
       </w:r>
     </w:p>
     <w:bookmarkEnd w:id="24"/>
@@ -496,7 +496,7 @@
           <w:bCs/>
           <w:b/>
         </w:rPr>
-        <w:t xml:space="preserve">sqmt</w:t>
+        <w:t xml:space="preserve">FloorArea</w:t>
       </w:r>
       <w:r>
         <w:t xml:space="preserve">: Property size in square meters.</w:t>
@@ -536,7 +536,7 @@
           <w:bCs/>
           <w:b/>
         </w:rPr>
-        <w:t xml:space="preserve">epc</w:t>
+        <w:t xml:space="preserve">EPC</w:t>
       </w:r>
       <w:r>
         <w:t xml:space="preserve">: The property’s energy performance rating (categorical with levels A to G, A being the most energy efficient).</w:t>
@@ -556,10 +556,10 @@
           <w:bCs/>
           <w:b/>
         </w:rPr>
-        <w:t xml:space="preserve">tax</w:t>
-      </w:r>
-      <w:r>
-        <w:t xml:space="preserve">: The council tax band based on the assumed property value in 1991 (categorical with levels A to G, G being the most expensive).</w:t>
+        <w:t xml:space="preserve">Tax</w:t>
+      </w:r>
+      <w:r>
+        <w:t xml:space="preserve">: The council Tax band based on the assumed property value in 1991 (categorical with levels A to G, G being the most expensive).</w:t>
       </w:r>
     </w:p>
     <w:p>
@@ -659,7 +659,7 @@
         <w:rPr>
           <w:rStyle w:val="NormalTok"/>
         </w:rPr>
-        <w:t xml:space="preserve">beds </w:t>
+        <w:t xml:space="preserve">Bedrooms </w:t>
       </w:r>
       <w:r>
         <w:rPr>
@@ -683,7 +683,7 @@
         <w:rPr>
           <w:rStyle w:val="NormalTok"/>
         </w:rPr>
-        <w:t xml:space="preserve">living</w:t>
+        <w:t xml:space="preserve">PublicRooms</w:t>
       </w:r>
     </w:p>
     <w:p>
@@ -700,7 +700,7 @@
         <w:rPr>
           <w:rStyle w:val="VerbatimChar"/>
         </w:rPr>
-        <w:t xml:space="preserve">epc</w:t>
+        <w:t xml:space="preserve">EPC</w:t>
       </w:r>
       <w:r>
         <w:t xml:space="preserve"> </w:t>
@@ -715,7 +715,7 @@
         <w:rPr>
           <w:rStyle w:val="VerbatimChar"/>
         </w:rPr>
-        <w:t xml:space="preserve">tax</w:t>
+        <w:t xml:space="preserve">Tax</w:t>
       </w:r>
       <w:r>
         <w:t xml:space="preserve"> </w:t>
@@ -748,7 +748,7 @@
         <w:rPr>
           <w:rStyle w:val="VerbatimChar"/>
         </w:rPr>
-        <w:t xml:space="preserve">tax</w:t>
+        <w:t xml:space="preserve">Tax</w:t>
       </w:r>
       <w:r>
         <w:t xml:space="preserve"> </w:t>
@@ -783,7 +783,7 @@
       </w:pPr>
       <m:oMath>
         <m:r>
-          <m:t>p</m:t>
+          <m:t>P</m:t>
         </m:r>
         <m:r>
           <m:t>r</m:t>
@@ -923,18 +923,33 @@
           <m:t>×</m:t>
         </m:r>
         <m:r>
-          <m:t>s</m:t>
+          <m:t>F</m:t>
         </m:r>
         <m:r>
-          <m:t>q</m:t>
+          <m:t>l</m:t>
         </m:r>
         <m:r>
-          <m:t>m</m:t>
+          <m:t>o</m:t>
+        </m:r>
+        <m:r>
+          <m:t>o</m:t>
+        </m:r>
+        <m:r>
+          <m:t>r</m:t>
+        </m:r>
+        <m:r>
+          <m:t>A</m:t>
+        </m:r>
+        <m:r>
+          <m:t>r</m:t>
+        </m:r>
+        <m:r>
+          <m:t>e</m:t>
         </m:r>
         <m:sSub>
           <m:e>
             <m:r>
-              <m:t>t</m:t>
+              <m:t>a</m:t>
             </m:r>
           </m:e>
           <m:sub>
@@ -1016,13 +1031,13 @@
           <m:t>×</m:t>
         </m:r>
         <m:r>
-          <m:t>e</m:t>
+          <m:t>E</m:t>
         </m:r>
         <m:r>
-          <m:t>p</m:t>
+          <m:t>P</m:t>
         </m:r>
         <m:r>
-          <m:t>c</m:t>
+          <m:t>C</m:t>
         </m:r>
         <m:sSub>
           <m:e>
@@ -1066,13 +1081,13 @@
           <m:t>×</m:t>
         </m:r>
         <m:r>
-          <m:t>e</m:t>
+          <m:t>E</m:t>
         </m:r>
         <m:r>
-          <m:t>p</m:t>
+          <m:t>P</m:t>
         </m:r>
         <m:r>
-          <m:t>c</m:t>
+          <m:t>C</m:t>
         </m:r>
         <m:sSub>
           <m:e>
@@ -1111,13 +1126,13 @@
           <m:t>×</m:t>
         </m:r>
         <m:r>
-          <m:t>e</m:t>
+          <m:t>E</m:t>
         </m:r>
         <m:r>
-          <m:t>p</m:t>
+          <m:t>P</m:t>
         </m:r>
         <m:r>
-          <m:t>c</m:t>
+          <m:t>C</m:t>
         </m:r>
         <m:sSub>
           <m:e>
@@ -1156,13 +1171,13 @@
           <m:t>×</m:t>
         </m:r>
         <m:r>
-          <m:t>e</m:t>
+          <m:t>E</m:t>
         </m:r>
         <m:r>
-          <m:t>p</m:t>
+          <m:t>P</m:t>
         </m:r>
         <m:r>
-          <m:t>c</m:t>
+          <m:t>C</m:t>
         </m:r>
         <m:sSub>
           <m:e>
@@ -1201,13 +1216,13 @@
           <m:t>×</m:t>
         </m:r>
         <m:r>
-          <m:t>e</m:t>
+          <m:t>E</m:t>
         </m:r>
         <m:r>
-          <m:t>p</m:t>
+          <m:t>P</m:t>
         </m:r>
         <m:r>
-          <m:t>c</m:t>
+          <m:t>C</m:t>
         </m:r>
         <m:sSub>
           <m:e>
@@ -1251,7 +1266,7 @@
           <m:t>×</m:t>
         </m:r>
         <m:r>
-          <m:t>t</m:t>
+          <m:t>T</m:t>
         </m:r>
         <m:r>
           <m:t>a</m:t>
@@ -1296,7 +1311,7 @@
           <m:t>×</m:t>
         </m:r>
         <m:r>
-          <m:t>t</m:t>
+          <m:t>T</m:t>
         </m:r>
         <m:r>
           <m:t>a</m:t>
@@ -1341,7 +1356,7 @@
           <m:t>×</m:t>
         </m:r>
         <m:r>
-          <m:t>t</m:t>
+          <m:t>T</m:t>
         </m:r>
         <m:r>
           <m:t>a</m:t>
@@ -1391,7 +1406,7 @@
           <m:t>×</m:t>
         </m:r>
         <m:r>
-          <m:t>t</m:t>
+          <m:t>T</m:t>
         </m:r>
         <m:r>
           <m:t>a</m:t>
@@ -1436,7 +1451,7 @@
           <m:t>×</m:t>
         </m:r>
         <m:r>
-          <m:t>t</m:t>
+          <m:t>T</m:t>
         </m:r>
         <m:r>
           <m:t>a</m:t>
@@ -1481,7 +1496,7 @@
           <m:t>×</m:t>
         </m:r>
         <m:r>
-          <m:t>t</m:t>
+          <m:t>T</m:t>
         </m:r>
         <m:r>
           <m:t>a</m:t>
@@ -1537,7 +1552,7 @@
         <w:t xml:space="preserve"> </w:t>
       </w:r>
       <w:r>
-        <w:t xml:space="preserve">is the intercept, representing a property with zero square meters, zero rooms, an EPC of B, and a tax band of A.</w:t>
+        <w:t xml:space="preserve">is the intercept, representing a property with zero square meters, zero rooms, an EPC of B, and a Tax band of A.</w:t>
       </w:r>
     </w:p>
     <w:p>
@@ -1719,7 +1734,7 @@
         <w:t xml:space="preserve"> </w:t>
       </w:r>
       <w:r>
-        <w:t xml:space="preserve">are the effects of each tax band compared to A.</w:t>
+        <w:t xml:space="preserve">are the effects of each Tax band compared to A.</w:t>
       </w:r>
     </w:p>
     <w:p>
@@ -1736,7 +1751,7 @@
         <w:rPr>
           <w:rStyle w:val="VerbatimChar"/>
         </w:rPr>
-        <w:t xml:space="preserve">epc</w:t>
+        <w:t xml:space="preserve">EPC</w:t>
       </w:r>
       <w:r>
         <w:t xml:space="preserve"> </w:t>
@@ -1751,13 +1766,13 @@
         <w:rPr>
           <w:rStyle w:val="VerbatimChar"/>
         </w:rPr>
-        <w:t xml:space="preserve">tax</w:t>
-      </w:r>
-      <w:r>
-        <w:t xml:space="preserve"> </w:t>
-      </w:r>
-      <w:r>
-        <w:t xml:space="preserve">being recorded as categories has made our model stupidly and crazily more complicated than it would otherwise be. If EPC and tax were continuous variables, we’d need to estimate just</w:t>
+        <w:t xml:space="preserve">Tax</w:t>
+      </w:r>
+      <w:r>
+        <w:t xml:space="preserve"> </w:t>
+      </w:r>
+      <w:r>
+        <w:t xml:space="preserve">being recorded as categories has made our model stupidly and crazily more complicated than it would otherwise be. If EPC and Tax were continuous variables, we’d need to estimate just</w:t>
       </w:r>
       <w:r>
         <w:t xml:space="preserve"> </w:t>
@@ -1824,7 +1839,7 @@
         <w:rPr>
           <w:rStyle w:val="NormalTok"/>
         </w:rPr>
-        <w:t xml:space="preserve">(price </w:t>
+        <w:t xml:space="preserve">(Price </w:t>
       </w:r>
       <w:r>
         <w:rPr>
@@ -1836,7 +1851,7 @@
         <w:rPr>
           <w:rStyle w:val="NormalTok"/>
         </w:rPr>
-        <w:t xml:space="preserve"> sqmt </w:t>
+        <w:t xml:space="preserve"> FloorArea </w:t>
       </w:r>
       <w:r>
         <w:rPr>
@@ -1860,7 +1875,7 @@
         <w:rPr>
           <w:rStyle w:val="NormalTok"/>
         </w:rPr>
-        <w:t xml:space="preserve"> epc </w:t>
+        <w:t xml:space="preserve"> EPC </w:t>
       </w:r>
       <w:r>
         <w:rPr>
@@ -1872,7 +1887,7 @@
         <w:rPr>
           <w:rStyle w:val="NormalTok"/>
         </w:rPr>
-        <w:t xml:space="preserve"> tax, </w:t>
+        <w:t xml:space="preserve"> Tax, </w:t>
       </w:r>
       <w:r>
         <w:rPr>
@@ -1950,7 +1965,7 @@
         <w:rPr>
           <w:rStyle w:val="VerbatimChar"/>
         </w:rPr>
-        <w:t xml:space="preserve">## lm(formula = price ~ sqmt + rooms + epc + tax, data = abdn)</w:t>
+        <w:t xml:space="preserve">## lm(formula = Price ~ FloorArea + rooms + EPC + Tax, data = abdn)</w:t>
       </w:r>
       <w:r>
         <w:br/>
@@ -1986,7 +2001,7 @@
         <w:rPr>
           <w:rStyle w:val="VerbatimChar"/>
         </w:rPr>
-        <w:t xml:space="preserve">## -622.33  -82.95   -4.81   53.88  910.43 </w:t>
+        <w:t xml:space="preserve">## -538.13  -95.46   -1.10   70.02  981.09 </w:t>
       </w:r>
       <w:r>
         <w:br/>
@@ -2013,133 +2028,142 @@
         <w:rPr>
           <w:rStyle w:val="VerbatimChar"/>
         </w:rPr>
-        <w:t xml:space="preserve">##               Estimate Std. Error t value Pr(&gt;|t|)    </w:t>
-      </w:r>
-      <w:r>
-        <w:br/>
-      </w:r>
-      <w:r>
-        <w:rPr>
-          <w:rStyle w:val="VerbatimChar"/>
-        </w:rPr>
-        <w:t xml:space="preserve">## (Intercept)  329.24652   78.20799   4.210 4.69e-05 ***</w:t>
-      </w:r>
-      <w:r>
-        <w:br/>
-      </w:r>
-      <w:r>
-        <w:rPr>
-          <w:rStyle w:val="VerbatimChar"/>
-        </w:rPr>
-        <w:t xml:space="preserve">## sqmt           0.09491    0.92824   0.102 0.918719    </w:t>
-      </w:r>
-      <w:r>
-        <w:br/>
-      </w:r>
-      <w:r>
-        <w:rPr>
-          <w:rStyle w:val="VerbatimChar"/>
-        </w:rPr>
-        <w:t xml:space="preserve">## rooms        175.11885   28.70803   6.100 1.10e-08 ***</w:t>
-      </w:r>
-      <w:r>
-        <w:br/>
-      </w:r>
-      <w:r>
-        <w:rPr>
-          <w:rStyle w:val="VerbatimChar"/>
-        </w:rPr>
-        <w:t xml:space="preserve">## epcc        -142.82581   55.11507  -2.591 0.010634 *  </w:t>
-      </w:r>
-      <w:r>
-        <w:br/>
-      </w:r>
-      <w:r>
-        <w:rPr>
-          <w:rStyle w:val="VerbatimChar"/>
-        </w:rPr>
-        <w:t xml:space="preserve">## epcd        -223.23608   59.82399  -3.732 0.000282 ***</w:t>
-      </w:r>
-      <w:r>
-        <w:br/>
-      </w:r>
-      <w:r>
-        <w:rPr>
-          <w:rStyle w:val="VerbatimChar"/>
-        </w:rPr>
-        <w:t xml:space="preserve">## epce        -153.16867   74.49666  -2.056 0.041749 *  </w:t>
-      </w:r>
-      <w:r>
-        <w:br/>
-      </w:r>
-      <w:r>
-        <w:rPr>
-          <w:rStyle w:val="VerbatimChar"/>
-        </w:rPr>
-        <w:t xml:space="preserve">## epcf        -198.65246  190.22361  -1.044 0.298251    </w:t>
-      </w:r>
-      <w:r>
-        <w:br/>
-      </w:r>
-      <w:r>
-        <w:rPr>
-          <w:rStyle w:val="VerbatimChar"/>
-        </w:rPr>
-        <w:t xml:space="preserve">## epcg        -132.09400  125.92256  -1.049 0.296090    </w:t>
-      </w:r>
-      <w:r>
-        <w:br/>
-      </w:r>
-      <w:r>
-        <w:rPr>
-          <w:rStyle w:val="VerbatimChar"/>
-        </w:rPr>
-        <w:t xml:space="preserve">## taxb          60.57588   54.79286   1.106 0.270935    </w:t>
-      </w:r>
-      <w:r>
-        <w:br/>
-      </w:r>
-      <w:r>
-        <w:rPr>
-          <w:rStyle w:val="VerbatimChar"/>
-        </w:rPr>
-        <w:t xml:space="preserve">## taxc          67.29495   60.48214   1.113 0.267885    </w:t>
-      </w:r>
-      <w:r>
-        <w:br/>
-      </w:r>
-      <w:r>
-        <w:rPr>
-          <w:rStyle w:val="VerbatimChar"/>
-        </w:rPr>
-        <w:t xml:space="preserve">## taxd          33.30104   56.88932   0.585 0.559301    </w:t>
-      </w:r>
-      <w:r>
-        <w:br/>
-      </w:r>
-      <w:r>
-        <w:rPr>
-          <w:rStyle w:val="VerbatimChar"/>
-        </w:rPr>
-        <w:t xml:space="preserve">## taxe         285.90432   66.69695   4.287 3.47e-05 ***</w:t>
-      </w:r>
-      <w:r>
-        <w:br/>
-      </w:r>
-      <w:r>
-        <w:rPr>
-          <w:rStyle w:val="VerbatimChar"/>
-        </w:rPr>
-        <w:t xml:space="preserve">## taxf         228.10775   87.27079   2.614 0.009994 ** </w:t>
-      </w:r>
-      <w:r>
-        <w:br/>
-      </w:r>
-      <w:r>
-        <w:rPr>
-          <w:rStyle w:val="VerbatimChar"/>
-        </w:rPr>
-        <w:t xml:space="preserve">## taxg         511.22725  131.94895   3.874 0.000168 ***</w:t>
+        <w:t xml:space="preserve">##              Estimate Std. Error t value Pr(&gt;|t|)    </w:t>
+      </w:r>
+      <w:r>
+        <w:br/>
+      </w:r>
+      <w:r>
+        <w:rPr>
+          <w:rStyle w:val="VerbatimChar"/>
+        </w:rPr>
+        <w:t xml:space="preserve">## (Intercept)  245.7087   179.5922   1.368   0.1720    </w:t>
+      </w:r>
+      <w:r>
+        <w:br/>
+      </w:r>
+      <w:r>
+        <w:rPr>
+          <w:rStyle w:val="VerbatimChar"/>
+        </w:rPr>
+        <w:t xml:space="preserve">## FloorArea      0.5096     0.5167   0.986   0.3246    </w:t>
+      </w:r>
+      <w:r>
+        <w:br/>
+      </w:r>
+      <w:r>
+        <w:rPr>
+          <w:rStyle w:val="VerbatimChar"/>
+        </w:rPr>
+        <w:t xml:space="preserve">## rooms        120.9949    14.6184   8.277 1.79e-15 ***</w:t>
+      </w:r>
+      <w:r>
+        <w:br/>
+      </w:r>
+      <w:r>
+        <w:rPr>
+          <w:rStyle w:val="VerbatimChar"/>
+        </w:rPr>
+        <w:t xml:space="preserve">## EPCB         198.9797   178.7270   1.113   0.2662    </w:t>
+      </w:r>
+      <w:r>
+        <w:br/>
+      </w:r>
+      <w:r>
+        <w:rPr>
+          <w:rStyle w:val="VerbatimChar"/>
+        </w:rPr>
+        <w:t xml:space="preserve">## EPCC          32.6251   176.9457   0.184   0.8538    </w:t>
+      </w:r>
+      <w:r>
+        <w:br/>
+      </w:r>
+      <w:r>
+        <w:rPr>
+          <w:rStyle w:val="VerbatimChar"/>
+        </w:rPr>
+        <w:t xml:space="preserve">## EPCD           2.1402   176.9763   0.012   0.9904    </w:t>
+      </w:r>
+      <w:r>
+        <w:br/>
+      </w:r>
+      <w:r>
+        <w:rPr>
+          <w:rStyle w:val="VerbatimChar"/>
+        </w:rPr>
+        <w:t xml:space="preserve">## EPCE         -48.3417   178.0508  -0.272   0.7861    </w:t>
+      </w:r>
+      <w:r>
+        <w:br/>
+      </w:r>
+      <w:r>
+        <w:rPr>
+          <w:rStyle w:val="VerbatimChar"/>
+        </w:rPr>
+        <w:t xml:space="preserve">## EPCF        -179.8645   198.2557  -0.907   0.3648    </w:t>
+      </w:r>
+      <w:r>
+        <w:br/>
+      </w:r>
+      <w:r>
+        <w:rPr>
+          <w:rStyle w:val="VerbatimChar"/>
+        </w:rPr>
+        <w:t xml:space="preserve">## TaxB          10.2223    29.7272   0.344   0.7311    </w:t>
+      </w:r>
+      <w:r>
+        <w:br/>
+      </w:r>
+      <w:r>
+        <w:rPr>
+          <w:rStyle w:val="VerbatimChar"/>
+        </w:rPr>
+        <w:t xml:space="preserve">## TaxC          67.3135    30.7861   2.186   0.0293 *  </w:t>
+      </w:r>
+      <w:r>
+        <w:br/>
+      </w:r>
+      <w:r>
+        <w:rPr>
+          <w:rStyle w:val="VerbatimChar"/>
+        </w:rPr>
+        <w:t xml:space="preserve">## TaxD         123.8335    30.7955   4.021 6.89e-05 ***</w:t>
+      </w:r>
+      <w:r>
+        <w:br/>
+      </w:r>
+      <w:r>
+        <w:rPr>
+          <w:rStyle w:val="VerbatimChar"/>
+        </w:rPr>
+        <w:t xml:space="preserve">## TaxE         171.9846    38.0672   4.518 8.17e-06 ***</w:t>
+      </w:r>
+      <w:r>
+        <w:br/>
+      </w:r>
+      <w:r>
+        <w:rPr>
+          <w:rStyle w:val="VerbatimChar"/>
+        </w:rPr>
+        <w:t xml:space="preserve">## TaxF         344.0041    56.1930   6.122 2.16e-09 ***</w:t>
+      </w:r>
+      <w:r>
+        <w:br/>
+      </w:r>
+      <w:r>
+        <w:rPr>
+          <w:rStyle w:val="VerbatimChar"/>
+        </w:rPr>
+        <w:t xml:space="preserve">## TaxG         694.4957    65.0135  10.682  &lt; 2e-16 ***</w:t>
+      </w:r>
+      <w:r>
+        <w:br/>
+      </w:r>
+      <w:r>
+        <w:rPr>
+          <w:rStyle w:val="VerbatimChar"/>
+        </w:rPr>
+        <w:t xml:space="preserve">## TaxH         990.0711   189.6340   5.221 2.83e-07 ***</w:t>
       </w:r>
       <w:r>
         <w:br/>
@@ -2175,25 +2199,25 @@
         <w:rPr>
           <w:rStyle w:val="VerbatimChar"/>
         </w:rPr>
-        <w:t xml:space="preserve">## Residual standard error: 182.4 on 132 degrees of freedom</w:t>
-      </w:r>
-      <w:r>
-        <w:br/>
-      </w:r>
-      <w:r>
-        <w:rPr>
-          <w:rStyle w:val="VerbatimChar"/>
-        </w:rPr>
-        <w:t xml:space="preserve">## Multiple R-squared:  0.7909, Adjusted R-squared:  0.7703 </w:t>
-      </w:r>
-      <w:r>
-        <w:br/>
-      </w:r>
-      <w:r>
-        <w:rPr>
-          <w:rStyle w:val="VerbatimChar"/>
-        </w:rPr>
-        <w:t xml:space="preserve">## F-statistic: 38.41 on 13 and 132 DF,  p-value: &lt; 2.2e-16</w:t>
+        <w:t xml:space="preserve">## Residual standard error: 175.5 on 411 degrees of freedom</w:t>
+      </w:r>
+      <w:r>
+        <w:br/>
+      </w:r>
+      <w:r>
+        <w:rPr>
+          <w:rStyle w:val="VerbatimChar"/>
+        </w:rPr>
+        <w:t xml:space="preserve">## Multiple R-squared:  0.7826, Adjusted R-squared:  0.7752 </w:t>
+      </w:r>
+      <w:r>
+        <w:br/>
+      </w:r>
+      <w:r>
+        <w:rPr>
+          <w:rStyle w:val="VerbatimChar"/>
+        </w:rPr>
+        <w:t xml:space="preserve">## F-statistic: 105.7 on 14 and 411 DF,  p-value: &lt; 2.2e-16</w:t>
       </w:r>
     </w:p>
     <w:p>
@@ -2389,7 +2413,7 @@
         <w:rPr>
           <w:rStyle w:val="VerbatimChar"/>
         </w:rPr>
-        <w:t xml:space="preserve">##   88</w:t>
+        <w:t xml:space="preserve">##   324, 329</w:t>
       </w:r>
     </w:p>
     <w:p>
@@ -2602,7 +2626,7 @@
         <w:rPr>
           <w:rStyle w:val="CommentTok"/>
         </w:rPr>
-        <w:t xml:space="preserve"># Yes, a few. We can see these in the Residuals vs. Leverage plot, particularly the rental properties on rows 112 and 88 of our dataset (note that 88 doesn’t appear on the plot but is highlighted by the text output).</w:t>
+        <w:t xml:space="preserve"># Yes, a few. We can see these in the Residuals vs. Leverage plot, particularly the rental properties on rows 324 and 329 of our dataset (note that these don’t appear on the plot but are highlighted by the text output).</w:t>
       </w:r>
     </w:p>
     <w:p>
@@ -2718,7 +2742,7 @@
         <w:rPr>
           <w:rStyle w:val="DecValTok"/>
         </w:rPr>
-        <w:t xml:space="preserve">112</w:t>
+        <w:t xml:space="preserve">324</w:t>
       </w:r>
       <w:r>
         <w:rPr>
@@ -2730,7 +2754,7 @@
         <w:rPr>
           <w:rStyle w:val="DecValTok"/>
         </w:rPr>
-        <w:t xml:space="preserve">88</w:t>
+        <w:t xml:space="preserve">329</w:t>
       </w:r>
       <w:r>
         <w:rPr>
@@ -2769,7 +2793,7 @@
         <w:rPr>
           <w:rStyle w:val="NormalTok"/>
         </w:rPr>
-        <w:t xml:space="preserve">(price </w:t>
+        <w:t xml:space="preserve">(Price </w:t>
       </w:r>
       <w:r>
         <w:rPr>
@@ -2781,7 +2805,7 @@
         <w:rPr>
           <w:rStyle w:val="NormalTok"/>
         </w:rPr>
-        <w:t xml:space="preserve"> sqmt </w:t>
+        <w:t xml:space="preserve"> FloorArea </w:t>
       </w:r>
       <w:r>
         <w:rPr>
@@ -2805,7 +2829,7 @@
         <w:rPr>
           <w:rStyle w:val="NormalTok"/>
         </w:rPr>
-        <w:t xml:space="preserve"> epc </w:t>
+        <w:t xml:space="preserve"> EPC </w:t>
       </w:r>
       <w:r>
         <w:rPr>
@@ -2817,7 +2841,7 @@
         <w:rPr>
           <w:rStyle w:val="NormalTok"/>
         </w:rPr>
-        <w:t xml:space="preserve"> tax, </w:t>
+        <w:t xml:space="preserve"> Tax, </w:t>
       </w:r>
       <w:r>
         <w:rPr>
@@ -2874,7 +2898,7 @@
         <w:rPr>
           <w:rStyle w:val="CommentTok"/>
         </w:rPr>
-        <w:t xml:space="preserve"># By comparing the two models, you can see the effect these observations had. For example, removing them means that the effect of sqmt changes from about 10p per extra square meter to £2.34 per extra square meter.</w:t>
+        <w:t xml:space="preserve"># By comparing the two models, you can see the effect these observations had. For example, removing them means that the effect of FloorArea changes from about 10p per extra square meter to £2.34 per extra square meter.</w:t>
       </w:r>
     </w:p>
     <w:p>
@@ -2882,7 +2906,7 @@
         <w:pStyle w:val="FirstParagraph"/>
       </w:pPr>
       <w:r>
-        <w:t xml:space="preserve">Given your dataset may be slightly different to the one I used above (given how you dealt with any changes in listed price, houses versus flats, etc.), you may have seen some issues in the Residuals verses Leverage plot (though you may not, which would be fine). If you did see any problematic observations, before moving ahead, remove any observations from your dataset where the associated Cook’s distance was</w:t>
+        <w:t xml:space="preserve">Given your dataset may be slightly different to the one I used above (given how you dealt with any changes in listed Price, houses versus flats, etc.), you may have seen some issues in the Residuals verses Leverage plot (though you may not, which would be fine). If you did see any problematic observations, before moving ahead, remove any observations from your dataset where the associated Cook’s distance was</w:t>
       </w:r>
       <w:r>
         <w:t xml:space="preserve"> </w:t>
@@ -3286,7 +3310,7 @@
         <w:rPr>
           <w:rStyle w:val="VerbatimChar"/>
         </w:rPr>
-        <w:t xml:space="preserve">## lm(formula = price ~ sqmt + rooms + epc + tax, data = abdn_trimmed)</w:t>
+        <w:t xml:space="preserve">## lm(formula = Price ~ FloorArea + rooms + EPC + Tax, data = abdn_trimmed)</w:t>
       </w:r>
       <w:r>
         <w:br/>
@@ -3322,7 +3346,7 @@
         <w:rPr>
           <w:rStyle w:val="VerbatimChar"/>
         </w:rPr>
-        <w:t xml:space="preserve">## -416.16  -74.58   -5.99   53.42  876.46 </w:t>
+        <w:t xml:space="preserve">## -538.13  -95.61   -1.54   70.10  981.09 </w:t>
       </w:r>
       <w:r>
         <w:br/>
@@ -3358,115 +3382,115 @@
         <w:rPr>
           <w:rStyle w:val="VerbatimChar"/>
         </w:rPr>
-        <w:t xml:space="preserve">## (Intercept)  405.4371    67.1331   6.039 1.50e-08 ***</w:t>
-      </w:r>
-      <w:r>
-        <w:br/>
-      </w:r>
-      <w:r>
-        <w:rPr>
-          <w:rStyle w:val="VerbatimChar"/>
-        </w:rPr>
-        <w:t xml:space="preserve">## sqmt           2.3428     0.8458   2.770 0.006421 ** </w:t>
-      </w:r>
-      <w:r>
-        <w:br/>
-      </w:r>
-      <w:r>
-        <w:rPr>
-          <w:rStyle w:val="VerbatimChar"/>
-        </w:rPr>
-        <w:t xml:space="preserve">## rooms         96.1799    26.6606   3.608 0.000438 ***</w:t>
-      </w:r>
-      <w:r>
-        <w:br/>
-      </w:r>
-      <w:r>
-        <w:rPr>
-          <w:rStyle w:val="VerbatimChar"/>
-        </w:rPr>
-        <w:t xml:space="preserve">## epcc        -138.5112    46.7317  -2.964 0.003609 ** </w:t>
-      </w:r>
-      <w:r>
-        <w:br/>
-      </w:r>
-      <w:r>
-        <w:rPr>
-          <w:rStyle w:val="VerbatimChar"/>
-        </w:rPr>
-        <w:t xml:space="preserve">## epcd        -205.0530    50.7821  -4.038 9.13e-05 ***</w:t>
-      </w:r>
-      <w:r>
-        <w:br/>
-      </w:r>
-      <w:r>
-        <w:rPr>
-          <w:rStyle w:val="VerbatimChar"/>
-        </w:rPr>
-        <w:t xml:space="preserve">## epce        -147.2898    63.1653  -2.332 0.021236 *  </w:t>
-      </w:r>
-      <w:r>
-        <w:br/>
-      </w:r>
-      <w:r>
-        <w:rPr>
-          <w:rStyle w:val="VerbatimChar"/>
-        </w:rPr>
-        <w:t xml:space="preserve">## epcg        -166.7224   106.8668  -1.560 0.121150    </w:t>
-      </w:r>
-      <w:r>
-        <w:br/>
-      </w:r>
-      <w:r>
-        <w:rPr>
-          <w:rStyle w:val="VerbatimChar"/>
-        </w:rPr>
-        <w:t xml:space="preserve">## taxb          58.7017    46.4554   1.264 0.208613    </w:t>
-      </w:r>
-      <w:r>
-        <w:br/>
-      </w:r>
-      <w:r>
-        <w:rPr>
-          <w:rStyle w:val="VerbatimChar"/>
-        </w:rPr>
-        <w:t xml:space="preserve">## taxc          72.6919    51.2836   1.417 0.158726    </w:t>
-      </w:r>
-      <w:r>
-        <w:br/>
-      </w:r>
-      <w:r>
-        <w:rPr>
-          <w:rStyle w:val="VerbatimChar"/>
-        </w:rPr>
-        <w:t xml:space="preserve">## taxd          56.1083    48.3345   1.161 0.247820    </w:t>
-      </w:r>
-      <w:r>
-        <w:br/>
-      </w:r>
-      <w:r>
-        <w:rPr>
-          <w:rStyle w:val="VerbatimChar"/>
-        </w:rPr>
-        <w:t xml:space="preserve">## taxe         275.7660    56.5645   4.875 3.09e-06 ***</w:t>
-      </w:r>
-      <w:r>
-        <w:br/>
-      </w:r>
-      <w:r>
-        <w:rPr>
-          <w:rStyle w:val="VerbatimChar"/>
-        </w:rPr>
-        <w:t xml:space="preserve">## taxf         270.0039    74.2153   3.638 0.000394 ***</w:t>
-      </w:r>
-      <w:r>
-        <w:br/>
-      </w:r>
-      <w:r>
-        <w:rPr>
-          <w:rStyle w:val="VerbatimChar"/>
-        </w:rPr>
-        <w:t xml:space="preserve">## taxg         294.1042   115.8032   2.540 0.012263 *  </w:t>
+        <w:t xml:space="preserve">## (Intercept)  444.6884    40.7250  10.919  &lt; 2e-16 ***</w:t>
+      </w:r>
+      <w:r>
+        <w:br/>
+      </w:r>
+      <w:r>
+        <w:rPr>
+          <w:rStyle w:val="VerbatimChar"/>
+        </w:rPr>
+        <w:t xml:space="preserve">## FloorArea      0.5096     0.5167   0.986   0.3246    </w:t>
+      </w:r>
+      <w:r>
+        <w:br/>
+      </w:r>
+      <w:r>
+        <w:rPr>
+          <w:rStyle w:val="VerbatimChar"/>
+        </w:rPr>
+        <w:t xml:space="preserve">## rooms        120.9949    14.6184   8.277 1.79e-15 ***</w:t>
+      </w:r>
+      <w:r>
+        <w:br/>
+      </w:r>
+      <w:r>
+        <w:rPr>
+          <w:rStyle w:val="VerbatimChar"/>
+        </w:rPr>
+        <w:t xml:space="preserve">## EPCC        -166.3545    29.5934  -5.621 3.50e-08 ***</w:t>
+      </w:r>
+      <w:r>
+        <w:br/>
+      </w:r>
+      <w:r>
+        <w:rPr>
+          <w:rStyle w:val="VerbatimChar"/>
+        </w:rPr>
+        <w:t xml:space="preserve">## EPCD        -196.8394    31.6801  -6.213 1.27e-09 ***</w:t>
+      </w:r>
+      <w:r>
+        <w:br/>
+      </w:r>
+      <w:r>
+        <w:rPr>
+          <w:rStyle w:val="VerbatimChar"/>
+        </w:rPr>
+        <w:t xml:space="preserve">## EPCE        -247.3214    35.3532  -6.996 1.08e-11 ***</w:t>
+      </w:r>
+      <w:r>
+        <w:br/>
+      </w:r>
+      <w:r>
+        <w:rPr>
+          <w:rStyle w:val="VerbatimChar"/>
+        </w:rPr>
+        <w:t xml:space="preserve">## EPCF        -378.8442    93.7041  -4.043 6.30e-05 ***</w:t>
+      </w:r>
+      <w:r>
+        <w:br/>
+      </w:r>
+      <w:r>
+        <w:rPr>
+          <w:rStyle w:val="VerbatimChar"/>
+        </w:rPr>
+        <w:t xml:space="preserve">## TaxB          10.2223    29.7272   0.344   0.7311    </w:t>
+      </w:r>
+      <w:r>
+        <w:br/>
+      </w:r>
+      <w:r>
+        <w:rPr>
+          <w:rStyle w:val="VerbatimChar"/>
+        </w:rPr>
+        <w:t xml:space="preserve">## TaxC          67.3135    30.7861   2.186   0.0293 *  </w:t>
+      </w:r>
+      <w:r>
+        <w:br/>
+      </w:r>
+      <w:r>
+        <w:rPr>
+          <w:rStyle w:val="VerbatimChar"/>
+        </w:rPr>
+        <w:t xml:space="preserve">## TaxD         123.8335    30.7955   4.021 6.89e-05 ***</w:t>
+      </w:r>
+      <w:r>
+        <w:br/>
+      </w:r>
+      <w:r>
+        <w:rPr>
+          <w:rStyle w:val="VerbatimChar"/>
+        </w:rPr>
+        <w:t xml:space="preserve">## TaxE         171.9846    38.0672   4.518 8.17e-06 ***</w:t>
+      </w:r>
+      <w:r>
+        <w:br/>
+      </w:r>
+      <w:r>
+        <w:rPr>
+          <w:rStyle w:val="VerbatimChar"/>
+        </w:rPr>
+        <w:t xml:space="preserve">## TaxF         344.0041    56.1930   6.122 2.16e-09 ***</w:t>
+      </w:r>
+      <w:r>
+        <w:br/>
+      </w:r>
+      <w:r>
+        <w:rPr>
+          <w:rStyle w:val="VerbatimChar"/>
+        </w:rPr>
+        <w:t xml:space="preserve">## TaxG         694.4957    65.0135  10.682  &lt; 2e-16 ***</w:t>
       </w:r>
       <w:r>
         <w:br/>
@@ -3502,25 +3526,25 @@
         <w:rPr>
           <w:rStyle w:val="VerbatimChar"/>
         </w:rPr>
-        <w:t xml:space="preserve">## Residual standard error: 154.6 on 131 degrees of freedom</w:t>
-      </w:r>
-      <w:r>
-        <w:br/>
-      </w:r>
-      <w:r>
-        <w:rPr>
-          <w:rStyle w:val="VerbatimChar"/>
-        </w:rPr>
-        <w:t xml:space="preserve">## Multiple R-squared:  0.798,  Adjusted R-squared:  0.7795 </w:t>
-      </w:r>
-      <w:r>
-        <w:br/>
-      </w:r>
-      <w:r>
-        <w:rPr>
-          <w:rStyle w:val="VerbatimChar"/>
-        </w:rPr>
-        <w:t xml:space="preserve">## F-statistic: 43.12 on 12 and 131 DF,  p-value: &lt; 2.2e-16</w:t>
+        <w:t xml:space="preserve">## Residual standard error: 175.5 on 411 degrees of freedom</w:t>
+      </w:r>
+      <w:r>
+        <w:br/>
+      </w:r>
+      <w:r>
+        <w:rPr>
+          <w:rStyle w:val="VerbatimChar"/>
+        </w:rPr>
+        <w:t xml:space="preserve">## Multiple R-squared:  0.7736, Adjusted R-squared:  0.767 </w:t>
+      </w:r>
+      <w:r>
+        <w:br/>
+      </w:r>
+      <w:r>
+        <w:rPr>
+          <w:rStyle w:val="VerbatimChar"/>
+        </w:rPr>
+        <w:t xml:space="preserve">## F-statistic:   117 on 12 and 411 DF,  p-value: &lt; 2.2e-16</w:t>
       </w:r>
     </w:p>
     <w:p>
@@ -3552,10 +3576,10 @@
         <w:rPr>
           <w:rStyle w:val="VerbatimChar"/>
         </w:rPr>
-        <w:t xml:space="preserve">sqmt</w:t>
-      </w:r>
-      <w:r>
-        <w:t xml:space="preserve">; the model seems to be predicting that adding an extra 1 square meter to a property only increases the rent by about £2.34. Seems a bit low, right? Do we really think that the difference in price between a 50 m</w:t>
+        <w:t xml:space="preserve">FloorArea</w:t>
+      </w:r>
+      <w:r>
+        <w:t xml:space="preserve">; the model seems to be predicting that adding an extra 1 square meter to a property only increases the rent by about £0.51. Seems a bit low, right? Do we really think that the difference in Price between a 50 m</w:t>
       </w:r>
       <m:oMath>
         <m:sSup>
@@ -3595,7 +3619,7 @@
         <w:t xml:space="preserve"> </w:t>
       </w:r>
       <w:r>
-        <w:t xml:space="preserve">flat will be just £117 extra per month? We’ll come back to this after we run the causal version of this model.</w:t>
+        <w:t xml:space="preserve">flat will be just £25.50 extra per month? We’ll come back to this after we run the causal version of this model.</w:t>
       </w:r>
     </w:p>
     <w:p>
@@ -3640,13 +3664,136 @@
     </w:p>
     <w:p>
       <w:pPr>
+        <w:pStyle w:val="FirstParagraph"/>
+      </w:pPr>
+      <w:r>
+        <w:t xml:space="preserve">Then ask</w:t>
+      </w:r>
+      <w:r>
+        <w:t xml:space="preserve"> </w:t>
+      </w:r>
+      <w:r>
+        <w:rPr>
+          <w:rStyle w:val="VerbatimChar"/>
+        </w:rPr>
+        <w:t xml:space="preserve">ggeffects</w:t>
+      </w:r>
+      <w:r>
+        <w:t xml:space="preserve"> </w:t>
+      </w:r>
+      <w:r>
+        <w:t xml:space="preserve">to show the predicted relationship (or association) between rent Price and each of our explanatory variables:</w:t>
+      </w:r>
+    </w:p>
+    <w:p>
+      <w:pPr>
         <w:pStyle w:val="SourceCode"/>
       </w:pPr>
       <w:r>
         <w:rPr>
-          <w:rStyle w:val="VerbatimChar"/>
-        </w:rPr>
-        <w:t xml:space="preserve">## Warning: package 'ggeffects' was built under R version 4.3.3</w:t>
+          <w:rStyle w:val="NormalTok"/>
+        </w:rPr>
+        <w:t xml:space="preserve">preds </w:t>
+      </w:r>
+      <w:r>
+        <w:rPr>
+          <w:rStyle w:val="OtherTok"/>
+        </w:rPr>
+        <w:t xml:space="preserve">&lt;-</w:t>
+      </w:r>
+      <w:r>
+        <w:rPr>
+          <w:rStyle w:val="NormalTok"/>
+        </w:rPr>
+        <w:t xml:space="preserve"> </w:t>
+      </w:r>
+      <w:r>
+        <w:rPr>
+          <w:rStyle w:val="FunctionTok"/>
+        </w:rPr>
+        <w:t xml:space="preserve">ggpredict</w:t>
+      </w:r>
+      <w:r>
+        <w:rPr>
+          <w:rStyle w:val="NormalTok"/>
+        </w:rPr>
+        <w:t xml:space="preserve">(rent_mod)</w:t>
+      </w:r>
+    </w:p>
+    <w:p>
+      <w:pPr>
+        <w:pStyle w:val="SourceCode"/>
+      </w:pPr>
+      <w:r>
+        <w:rPr>
+          <w:rStyle w:val="VerbatimChar"/>
+        </w:rPr>
+        <w:t xml:space="preserve">## Some of the focal terms are of type `character`. This may lead to</w:t>
+      </w:r>
+      <w:r>
+        <w:br/>
+      </w:r>
+      <w:r>
+        <w:rPr>
+          <w:rStyle w:val="VerbatimChar"/>
+        </w:rPr>
+        <w:t xml:space="preserve">##   unexpected results. It is recommended to convert these variables to</w:t>
+      </w:r>
+      <w:r>
+        <w:br/>
+      </w:r>
+      <w:r>
+        <w:rPr>
+          <w:rStyle w:val="VerbatimChar"/>
+        </w:rPr>
+        <w:t xml:space="preserve">##   factors before fitting the model.</w:t>
+      </w:r>
+      <w:r>
+        <w:br/>
+      </w:r>
+      <w:r>
+        <w:rPr>
+          <w:rStyle w:val="VerbatimChar"/>
+        </w:rPr>
+        <w:t xml:space="preserve">##   The following variables are of type character: `EPC`</w:t>
+      </w:r>
+    </w:p>
+    <w:p>
+      <w:pPr>
+        <w:pStyle w:val="SourceCode"/>
+      </w:pPr>
+      <w:r>
+        <w:rPr>
+          <w:rStyle w:val="VerbatimChar"/>
+        </w:rPr>
+        <w:t xml:space="preserve">## Some of the focal terms are of type `character`. This may lead to</w:t>
+      </w:r>
+      <w:r>
+        <w:br/>
+      </w:r>
+      <w:r>
+        <w:rPr>
+          <w:rStyle w:val="VerbatimChar"/>
+        </w:rPr>
+        <w:t xml:space="preserve">##   unexpected results. It is recommended to convert these variables to</w:t>
+      </w:r>
+      <w:r>
+        <w:br/>
+      </w:r>
+      <w:r>
+        <w:rPr>
+          <w:rStyle w:val="VerbatimChar"/>
+        </w:rPr>
+        <w:t xml:space="preserve">##   factors before fitting the model.</w:t>
+      </w:r>
+      <w:r>
+        <w:br/>
+      </w:r>
+      <w:r>
+        <w:rPr>
+          <w:rStyle w:val="VerbatimChar"/>
+        </w:rPr>
+        <w:t xml:space="preserve">##   The following variables are of type character: `Tax`</w:t>
       </w:r>
     </w:p>
     <w:p>
@@ -3654,22 +3801,7 @@
         <w:pStyle w:val="FirstParagraph"/>
       </w:pPr>
       <w:r>
-        <w:t xml:space="preserve">Then ask</w:t>
-      </w:r>
-      <w:r>
-        <w:t xml:space="preserve"> </w:t>
-      </w:r>
-      <w:r>
-        <w:rPr>
-          <w:rStyle w:val="VerbatimChar"/>
-        </w:rPr>
-        <w:t xml:space="preserve">ggeffects</w:t>
-      </w:r>
-      <w:r>
-        <w:t xml:space="preserve"> </w:t>
-      </w:r>
-      <w:r>
-        <w:t xml:space="preserve">to show the predicted relationship (or association) between rent price and each of our explanatory variables:</w:t>
+        <w:t xml:space="preserve">Now we just need to plot it (note you may need to press the blue arrow buttons in the Plots pane in RStudio to page through the different figures):</w:t>
       </w:r>
     </w:p>
     <w:p>
@@ -3678,33 +3810,15 @@
       </w:pPr>
       <w:r>
         <w:rPr>
-          <w:rStyle w:val="NormalTok"/>
-        </w:rPr>
-        <w:t xml:space="preserve">preds </w:t>
-      </w:r>
-      <w:r>
-        <w:rPr>
-          <w:rStyle w:val="OtherTok"/>
-        </w:rPr>
-        <w:t xml:space="preserve">&lt;-</w:t>
-      </w:r>
-      <w:r>
-        <w:rPr>
-          <w:rStyle w:val="NormalTok"/>
-        </w:rPr>
-        <w:t xml:space="preserve"> </w:t>
-      </w:r>
-      <w:r>
-        <w:rPr>
           <w:rStyle w:val="FunctionTok"/>
         </w:rPr>
-        <w:t xml:space="preserve">ggpredict</w:t>
-      </w:r>
-      <w:r>
-        <w:rPr>
-          <w:rStyle w:val="NormalTok"/>
-        </w:rPr>
-        <w:t xml:space="preserve">(rent_mod)</w:t>
+        <w:t xml:space="preserve">plot</w:t>
+      </w:r>
+      <w:r>
+        <w:rPr>
+          <w:rStyle w:val="NormalTok"/>
+        </w:rPr>
+        <w:t xml:space="preserve">(preds)</w:t>
       </w:r>
     </w:p>
     <w:p>
@@ -3715,108 +3829,7 @@
         <w:rPr>
           <w:rStyle w:val="VerbatimChar"/>
         </w:rPr>
-        <w:t xml:space="preserve">## Warning: Some of the focal terms are of type `character`. This may lead to</w:t>
-      </w:r>
-      <w:r>
-        <w:br/>
-      </w:r>
-      <w:r>
-        <w:rPr>
-          <w:rStyle w:val="VerbatimChar"/>
-        </w:rPr>
-        <w:t xml:space="preserve">##   unexpected results. It is recommended to convert these variables to</w:t>
-      </w:r>
-      <w:r>
-        <w:br/>
-      </w:r>
-      <w:r>
-        <w:rPr>
-          <w:rStyle w:val="VerbatimChar"/>
-        </w:rPr>
-        <w:t xml:space="preserve">##   factors before fitting the model.</w:t>
-      </w:r>
-      <w:r>
-        <w:br/>
-      </w:r>
-      <w:r>
-        <w:rPr>
-          <w:rStyle w:val="VerbatimChar"/>
-        </w:rPr>
-        <w:t xml:space="preserve">##   The following variables in are of type character: `epc`</w:t>
-      </w:r>
-    </w:p>
-    <w:p>
-      <w:pPr>
-        <w:pStyle w:val="SourceCode"/>
-      </w:pPr>
-      <w:r>
-        <w:rPr>
-          <w:rStyle w:val="VerbatimChar"/>
-        </w:rPr>
-        <w:t xml:space="preserve">## Warning: Some of the focal terms are of type `character`. This may lead to</w:t>
-      </w:r>
-      <w:r>
-        <w:br/>
-      </w:r>
-      <w:r>
-        <w:rPr>
-          <w:rStyle w:val="VerbatimChar"/>
-        </w:rPr>
-        <w:t xml:space="preserve">##   unexpected results. It is recommended to convert these variables to</w:t>
-      </w:r>
-      <w:r>
-        <w:br/>
-      </w:r>
-      <w:r>
-        <w:rPr>
-          <w:rStyle w:val="VerbatimChar"/>
-        </w:rPr>
-        <w:t xml:space="preserve">##   factors before fitting the model.</w:t>
-      </w:r>
-      <w:r>
-        <w:br/>
-      </w:r>
-      <w:r>
-        <w:rPr>
-          <w:rStyle w:val="VerbatimChar"/>
-        </w:rPr>
-        <w:t xml:space="preserve">##   The following variables in are of type character: `tax`</w:t>
-      </w:r>
-    </w:p>
-    <w:p>
-      <w:pPr>
-        <w:pStyle w:val="FirstParagraph"/>
-      </w:pPr>
-      <w:r>
-        <w:t xml:space="preserve">Now we just need to plot it (note you may need to press the blue arrow buttons in the Plots pane in RStudio to page through the different figures):</w:t>
-      </w:r>
-    </w:p>
-    <w:p>
-      <w:pPr>
-        <w:pStyle w:val="SourceCode"/>
-      </w:pPr>
-      <w:r>
-        <w:rPr>
-          <w:rStyle w:val="FunctionTok"/>
-        </w:rPr>
-        <w:t xml:space="preserve">plot</w:t>
-      </w:r>
-      <w:r>
-        <w:rPr>
-          <w:rStyle w:val="NormalTok"/>
-        </w:rPr>
-        <w:t xml:space="preserve">(preds)</w:t>
-      </w:r>
-    </w:p>
-    <w:p>
-      <w:pPr>
-        <w:pStyle w:val="SourceCode"/>
-      </w:pPr>
-      <w:r>
-        <w:rPr>
-          <w:rStyle w:val="VerbatimChar"/>
-        </w:rPr>
-        <w:t xml:space="preserve">## $sqmt</w:t>
+        <w:t xml:space="preserve">## $FloorArea</w:t>
       </w:r>
     </w:p>
     <w:p>
@@ -3950,7 +3963,7 @@
         <w:rPr>
           <w:rStyle w:val="VerbatimChar"/>
         </w:rPr>
-        <w:t xml:space="preserve">## $epc</w:t>
+        <w:t xml:space="preserve">## $EPC</w:t>
       </w:r>
     </w:p>
     <w:p>
@@ -4017,7 +4030,7 @@
         <w:rPr>
           <w:rStyle w:val="VerbatimChar"/>
         </w:rPr>
-        <w:t xml:space="preserve">## $tax</w:t>
+        <w:t xml:space="preserve">## $Tax</w:t>
       </w:r>
     </w:p>
     <w:p>
@@ -4203,7 +4216,7 @@
         <w:rPr>
           <w:rStyle w:val="AttributeTok"/>
         </w:rPr>
-        <w:t xml:space="preserve">sqmt =</w:t>
+        <w:t xml:space="preserve">FloorArea =</w:t>
       </w:r>
       <w:r>
         <w:rPr>
@@ -4257,7 +4270,7 @@
         <w:rPr>
           <w:rStyle w:val="NormalTok"/>
         </w:rPr>
-        <w:t xml:space="preserve">sqmt), </w:t>
+        <w:t xml:space="preserve">FloorArea), </w:t>
       </w:r>
       <w:r>
         <w:rPr>
@@ -4293,7 +4306,7 @@
         <w:rPr>
           <w:rStyle w:val="NormalTok"/>
         </w:rPr>
-        <w:t xml:space="preserve">sqmt), </w:t>
+        <w:t xml:space="preserve">FloorArea), </w:t>
       </w:r>
       <w:r>
         <w:rPr>
@@ -4377,7 +4390,7 @@
         <w:rPr>
           <w:rStyle w:val="AttributeTok"/>
         </w:rPr>
-        <w:t xml:space="preserve">tax =</w:t>
+        <w:t xml:space="preserve">Tax =</w:t>
       </w:r>
       <w:r>
         <w:rPr>
@@ -4389,7 +4402,7 @@
         <w:rPr>
           <w:rStyle w:val="StringTok"/>
         </w:rPr>
-        <w:t xml:space="preserve">"d"</w:t>
+        <w:t xml:space="preserve">"D"</w:t>
       </w:r>
       <w:r>
         <w:rPr>
@@ -4410,7 +4423,7 @@
         <w:rPr>
           <w:rStyle w:val="AttributeTok"/>
         </w:rPr>
-        <w:t xml:space="preserve">epc =</w:t>
+        <w:t xml:space="preserve">EPC =</w:t>
       </w:r>
       <w:r>
         <w:rPr>
@@ -4422,7 +4435,7 @@
         <w:rPr>
           <w:rStyle w:val="StringTok"/>
         </w:rPr>
-        <w:t xml:space="preserve">"d"</w:t>
+        <w:t xml:space="preserve">"D"</w:t>
       </w:r>
       <w:r>
         <w:br/>
@@ -4800,7 +4813,7 @@
         <w:rPr>
           <w:rStyle w:val="NormalTok"/>
         </w:rPr>
-        <w:t xml:space="preserve"> sqmt, </w:t>
+        <w:t xml:space="preserve"> FloorArea, </w:t>
       </w:r>
       <w:r>
         <w:rPr>
@@ -4923,7 +4936,7 @@
         <w:rPr>
           <w:rStyle w:val="NormalTok"/>
         </w:rPr>
-        <w:t xml:space="preserve"> sqmt, </w:t>
+        <w:t xml:space="preserve"> FloorArea, </w:t>
       </w:r>
       <w:r>
         <w:rPr>
@@ -5013,7 +5026,7 @@
         <w:rPr>
           <w:rStyle w:val="StringTok"/>
         </w:rPr>
-        <w:t xml:space="preserve">"Predicted rental price"</w:t>
+        <w:t xml:space="preserve">"Predicted rental Price"</w:t>
       </w:r>
       <w:r>
         <w:rPr>
@@ -5106,7 +5119,7 @@
         <w:rPr>
           <w:rStyle w:val="CommentTok"/>
         </w:rPr>
-        <w:t xml:space="preserve"># No, we can't identify causal relationships with this model. This model is designed to predict rent prices and not to understand the cause-and-effect relationship between variables.</w:t>
+        <w:t xml:space="preserve"># No, we can't identify causal relationships with this model. This model is designed to predict rent Prices and not to understand the cause-and-effect relationship between variables.</w:t>
       </w:r>
     </w:p>
     <w:p>
@@ -5127,7 +5140,7 @@
         <w:rPr>
           <w:rStyle w:val="VerbatimChar"/>
         </w:rPr>
-        <w:t xml:space="preserve">price</w:t>
+        <w:t xml:space="preserve">Price</w:t>
       </w:r>
       <w:r>
         <w:t xml:space="preserve"> </w:t>
@@ -5142,7 +5155,7 @@
         <w:rPr>
           <w:rStyle w:val="VerbatimChar"/>
         </w:rPr>
-        <w:t xml:space="preserve">sqmt</w:t>
+        <w:t xml:space="preserve">FloorArea</w:t>
       </w:r>
       <w:r>
         <w:t xml:space="preserve"> </w:t>
@@ -5159,7 +5172,7 @@
         <w:rPr>
           <w:rStyle w:val="CommentTok"/>
         </w:rPr>
-        <w:t xml:space="preserve"># Probably because the size of the property *causes* the number of rooms you have. So if we provide the model with both explanatory variables sqmt and rooms, it only needs rooms to make an accurate prediction. Having both sqmt and rooms is redundant (for predictive modelling), because sqmt → rooms → price (or size causes rooms causes price). Basically, the model can "ignore" sqmt once we've told it about rooms.</w:t>
+        <w:t xml:space="preserve"># Probably because the size of the property *causes* the number of rooms you have. So if we provide the model with both explanatory variables FloorArea and rooms, it only needs rooms to make an accurate prediction. Having both FloorArea and rooms is redundant (for predictive modelling), because FloorArea → rooms → Price (or size causes rooms causes Price). Basically, the model can "ignore" FloorArea once we've told it about rooms.</w:t>
       </w:r>
     </w:p>
     <w:p>
@@ -5185,7 +5198,7 @@
         </w:r>
       </w:hyperlink>
       <w:r>
-        <w:t xml:space="preserve">, and find a recently listed rental property which has all of the explanatory variables you need. Using your selected property, see how well your model predicts the rent. You’re also welcome to use your own flat if you know (or can guess) how many square meters it has, what the EPC rating is, and which tax band it falls in.</w:t>
+        <w:t xml:space="preserve">, and find a recently listed rental property which has all of the explanatory variables you need. Using your selected property, see how well your model predicts the rent. You’re also welcome to use your own flat if you know (or can guess) how many square meters it has, what the EPC rating is, and which Tax band it falls in.</w:t>
       </w:r>
     </w:p>
     <w:p>
@@ -5289,7 +5302,7 @@
         <w:rPr>
           <w:rStyle w:val="AttributeTok"/>
         </w:rPr>
-        <w:t xml:space="preserve">sqmt =</w:t>
+        <w:t xml:space="preserve">FloorArea =</w:t>
       </w:r>
       <w:r>
         <w:rPr>
@@ -5322,7 +5335,7 @@
         <w:rPr>
           <w:rStyle w:val="AttributeTok"/>
         </w:rPr>
-        <w:t xml:space="preserve">epc =</w:t>
+        <w:t xml:space="preserve">EPC =</w:t>
       </w:r>
       <w:r>
         <w:rPr>
@@ -5334,7 +5347,7 @@
         <w:rPr>
           <w:rStyle w:val="StringTok"/>
         </w:rPr>
-        <w:t xml:space="preserve">"c"</w:t>
+        <w:t xml:space="preserve">"C"</w:t>
       </w:r>
       <w:r>
         <w:rPr>
@@ -5355,7 +5368,7 @@
         <w:rPr>
           <w:rStyle w:val="AttributeTok"/>
         </w:rPr>
-        <w:t xml:space="preserve">tax =</w:t>
+        <w:t xml:space="preserve">Tax =</w:t>
       </w:r>
       <w:r>
         <w:rPr>
@@ -5367,7 +5380,7 @@
         <w:rPr>
           <w:rStyle w:val="StringTok"/>
         </w:rPr>
-        <w:t xml:space="preserve">"c"</w:t>
+        <w:t xml:space="preserve">"C"</w:t>
       </w:r>
       <w:r>
         <w:br/>
@@ -5418,7 +5431,7 @@
         <w:rPr>
           <w:rStyle w:val="CommentTok"/>
         </w:rPr>
-        <w:t xml:space="preserve"># The model predicts this property should be £785, and is actually listed at £800 - £25 off is not bad for predicting the rent of a flat the model has never seen before! (That £25 is also the residual error!)</w:t>
+        <w:t xml:space="preserve"># The model predicts this property should be £740, and is actually listed at £800; £60 off is not bad for predicting the rent of a flat the model has never seen before! (That £60 is also the residual error!)</w:t>
       </w:r>
       <w:r>
         <w:br/>
@@ -5577,7 +5590,7 @@
         <w:pStyle w:val="FirstParagraph"/>
       </w:pPr>
       <w:r>
-        <w:t xml:space="preserve">Having run a model that aims to predict rent price, we’re now going to switch over to causal modelling using the same dataset. Hopefully the differences and similarities between the two approaches will become clear.</w:t>
+        <w:t xml:space="preserve">Having run a model that aims to predict rent Price, we’re now going to switch over to causal modelling using the same dataset. Hopefully the differences and similarities between the two approaches will become clear.</w:t>
       </w:r>
     </w:p>
     <w:p>
@@ -5602,7 +5615,7 @@
         <w:pStyle w:val="FirstParagraph"/>
       </w:pPr>
       <w:r>
-        <w:t xml:space="preserve">Our research question is going to be to understand the causal effect of square meters on rent price, or</w:t>
+        <w:t xml:space="preserve">Our research question is going to be to understand the causal effect of square meters on rent Price, or</w:t>
       </w:r>
       <w:r>
         <w:t xml:space="preserve"> </w:t>
@@ -5979,7 +5992,7 @@
         <w:pStyle w:val="Compact"/>
       </w:pPr>
       <w:r>
-        <w:t xml:space="preserve">You need to outline what you believe the causal relationships are. For example, if you think rent is influenced by the number of rooms, square meters, tax band, and EPC, you would</w:t>
+        <w:t xml:space="preserve">You need to outline what you believe the causal relationships are. For example, if you think rent is influenced by the number of rooms, square meters, Tax band, and EPC, you would</w:t>
       </w:r>
       <w:r>
         <w:t xml:space="preserve"> </w:t>
@@ -6006,7 +6019,7 @@
         <w:rPr>
           <w:rStyle w:val="VerbatimChar"/>
         </w:rPr>
-        <w:t xml:space="preserve">Rent ~ Rooms + Sqmt + Tax + EPC</w:t>
+        <w:t xml:space="preserve">Rent ~ Rooms + FloorArea + Tax + EPC</w:t>
       </w:r>
       <w:r>
         <w:t xml:space="preserve">. Note that the variable names in the model don’t have to match those in your dataset; just avoid using spaces in variable names, e.g., use</w:t>
@@ -6085,7 +6098,7 @@
         <w:rPr>
           <w:rStyle w:val="VerbatimChar"/>
         </w:rPr>
-        <w:t xml:space="preserve">Rooms ~ Sqmt</w:t>
+        <w:t xml:space="preserve">Rooms ~ FloorArea</w:t>
       </w:r>
       <w:r>
         <w:t xml:space="preserve">, and so on for the other explanatory variables.</w:t>
@@ -6160,7 +6173,7 @@
         <w:rPr>
           <w:rStyle w:val="VerbatimChar"/>
         </w:rPr>
-        <w:t xml:space="preserve">Rent ~ Sqmt</w:t>
+        <w:t xml:space="preserve">Rent ~ FloorArea</w:t>
       </w:r>
       <w:r>
         <w:t xml:space="preserve">.</w:t>
@@ -6190,22 +6203,9 @@
         </w:rPr>
         <w:t xml:space="preserve">(performance)</w:t>
       </w:r>
-    </w:p>
-    <w:p>
-      <w:pPr>
-        <w:pStyle w:val="SourceCode"/>
-      </w:pPr>
-      <w:r>
-        <w:rPr>
-          <w:rStyle w:val="VerbatimChar"/>
-        </w:rPr>
-        <w:t xml:space="preserve">## Warning: package 'performance' was built under R version 4.3.3</w:t>
-      </w:r>
-    </w:p>
-    <w:p>
-      <w:pPr>
-        <w:pStyle w:val="SourceCode"/>
-      </w:pPr>
+      <w:r>
+        <w:br/>
+      </w:r>
       <w:r>
         <w:rPr>
           <w:rStyle w:val="FunctionTok"/>
@@ -6218,22 +6218,9 @@
         </w:rPr>
         <w:t xml:space="preserve">(see)</w:t>
       </w:r>
-    </w:p>
-    <w:p>
-      <w:pPr>
-        <w:pStyle w:val="SourceCode"/>
-      </w:pPr>
-      <w:r>
-        <w:rPr>
-          <w:rStyle w:val="VerbatimChar"/>
-        </w:rPr>
-        <w:t xml:space="preserve">## Warning: package 'see' was built under R version 4.3.3</w:t>
-      </w:r>
-    </w:p>
-    <w:p>
-      <w:pPr>
-        <w:pStyle w:val="SourceCode"/>
-      </w:pPr>
+      <w:r>
+        <w:br/>
+      </w:r>
       <w:r>
         <w:rPr>
           <w:rStyle w:val="NormalTok"/>
@@ -6271,7 +6258,7 @@
         <w:rPr>
           <w:rStyle w:val="NormalTok"/>
         </w:rPr>
-        <w:t xml:space="preserve">  price </w:t>
+        <w:t xml:space="preserve">  Price </w:t>
       </w:r>
       <w:r>
         <w:rPr>
@@ -6295,7 +6282,7 @@
         <w:rPr>
           <w:rStyle w:val="NormalTok"/>
         </w:rPr>
-        <w:t xml:space="preserve"> sqmt </w:t>
+        <w:t xml:space="preserve"> FloorArea </w:t>
       </w:r>
       <w:r>
         <w:rPr>
@@ -6307,7 +6294,7 @@
         <w:rPr>
           <w:rStyle w:val="NormalTok"/>
         </w:rPr>
-        <w:t xml:space="preserve"> tax </w:t>
+        <w:t xml:space="preserve"> Tax </w:t>
       </w:r>
       <w:r>
         <w:rPr>
@@ -6319,7 +6306,7 @@
         <w:rPr>
           <w:rStyle w:val="NormalTok"/>
         </w:rPr>
-        <w:t xml:space="preserve"> epc,</w:t>
+        <w:t xml:space="preserve"> EPC,</w:t>
       </w:r>
       <w:r>
         <w:br/>
@@ -6340,16 +6327,16 @@
         <w:rPr>
           <w:rStyle w:val="NormalTok"/>
         </w:rPr>
-        <w:t xml:space="preserve"> sqmt,</w:t>
-      </w:r>
-      <w:r>
-        <w:br/>
-      </w:r>
-      <w:r>
-        <w:rPr>
-          <w:rStyle w:val="NormalTok"/>
-        </w:rPr>
-        <w:t xml:space="preserve">  epc </w:t>
+        <w:t xml:space="preserve"> FloorArea,</w:t>
+      </w:r>
+      <w:r>
+        <w:br/>
+      </w:r>
+      <w:r>
+        <w:rPr>
+          <w:rStyle w:val="NormalTok"/>
+        </w:rPr>
+        <w:t xml:space="preserve">  EPC </w:t>
       </w:r>
       <w:r>
         <w:rPr>
@@ -6361,16 +6348,16 @@
         <w:rPr>
           <w:rStyle w:val="NormalTok"/>
         </w:rPr>
-        <w:t xml:space="preserve"> sqmt,</w:t>
-      </w:r>
-      <w:r>
-        <w:br/>
-      </w:r>
-      <w:r>
-        <w:rPr>
-          <w:rStyle w:val="NormalTok"/>
-        </w:rPr>
-        <w:t xml:space="preserve">  tax </w:t>
+        <w:t xml:space="preserve"> FloorArea,</w:t>
+      </w:r>
+      <w:r>
+        <w:br/>
+      </w:r>
+      <w:r>
+        <w:rPr>
+          <w:rStyle w:val="NormalTok"/>
+        </w:rPr>
+        <w:t xml:space="preserve">  Tax </w:t>
       </w:r>
       <w:r>
         <w:rPr>
@@ -6382,7 +6369,7 @@
         <w:rPr>
           <w:rStyle w:val="NormalTok"/>
         </w:rPr>
-        <w:t xml:space="preserve"> sqmt,</w:t>
+        <w:t xml:space="preserve"> FloorArea,</w:t>
       </w:r>
       <w:r>
         <w:br/>
@@ -6409,7 +6396,7 @@
         <w:rPr>
           <w:rStyle w:val="StringTok"/>
         </w:rPr>
-        <w:t xml:space="preserve">"sqmt"</w:t>
+        <w:t xml:space="preserve">"FloorArea"</w:t>
       </w:r>
       <w:r>
         <w:rPr>
@@ -6442,7 +6429,7 @@
         <w:rPr>
           <w:rStyle w:val="StringTok"/>
         </w:rPr>
-        <w:t xml:space="preserve">"price"</w:t>
+        <w:t xml:space="preserve">"Price"</w:t>
       </w:r>
       <w:r>
         <w:br/>
@@ -6537,7 +6524,7 @@
         <w:rPr>
           <w:rStyle w:val="VerbatimChar"/>
         </w:rPr>
-        <w:t xml:space="preserve">sqmt</w:t>
+        <w:t xml:space="preserve">FloorArea</w:t>
       </w:r>
       <w:r>
         <w:t xml:space="preserve"> </w:t>
@@ -6552,7 +6539,7 @@
         <w:rPr>
           <w:rStyle w:val="VerbatimChar"/>
         </w:rPr>
-        <w:t xml:space="preserve">tax</w:t>
+        <w:t xml:space="preserve">Tax</w:t>
       </w:r>
       <w:r>
         <w:t xml:space="preserve"> </w:t>
@@ -6567,7 +6554,7 @@
         <w:rPr>
           <w:rStyle w:val="VerbatimChar"/>
         </w:rPr>
-        <w:t xml:space="preserve">sqmt</w:t>
+        <w:t xml:space="preserve">FloorArea</w:t>
       </w:r>
       <w:r>
         <w:t xml:space="preserve"> </w:t>
@@ -6582,7 +6569,7 @@
         <w:rPr>
           <w:rStyle w:val="VerbatimChar"/>
         </w:rPr>
-        <w:t xml:space="preserve">tax</w:t>
+        <w:t xml:space="preserve">Tax</w:t>
       </w:r>
       <w:r>
         <w:t xml:space="preserve">.</w:t>
@@ -6610,7 +6597,7 @@
         <w:rPr>
           <w:rStyle w:val="NormalTok"/>
         </w:rPr>
-        <w:t xml:space="preserve">(price </w:t>
+        <w:t xml:space="preserve">(Price </w:t>
       </w:r>
       <w:r>
         <w:rPr>
@@ -6622,7 +6609,7 @@
         <w:rPr>
           <w:rStyle w:val="NormalTok"/>
         </w:rPr>
-        <w:t xml:space="preserve"> sqmt, </w:t>
+        <w:t xml:space="preserve"> FloorArea, </w:t>
       </w:r>
       <w:r>
         <w:rPr>
@@ -6667,7 +6654,7 @@
         <w:rPr>
           <w:rStyle w:val="VerbatimChar"/>
         </w:rPr>
-        <w:t xml:space="preserve">sqmt</w:t>
+        <w:t xml:space="preserve">FloorArea</w:t>
       </w:r>
       <w:r>
         <w:t xml:space="preserve"> </w:t>
@@ -6682,7 +6669,7 @@
         <w:rPr>
           <w:rStyle w:val="VerbatimChar"/>
         </w:rPr>
-        <w:t xml:space="preserve">price</w:t>
+        <w:t xml:space="preserve">Price</w:t>
       </w:r>
       <w:r>
         <w:t xml:space="preserve">. In this case, they look identical? Why is that? Well, note that</w:t>
@@ -6694,7 +6681,7 @@
         <w:rPr>
           <w:rStyle w:val="VerbatimChar"/>
         </w:rPr>
-        <w:t xml:space="preserve">sqmt</w:t>
+        <w:t xml:space="preserve">FloorArea</w:t>
       </w:r>
       <w:r>
         <w:t xml:space="preserve"> </w:t>
@@ -6709,7 +6696,7 @@
         <w:rPr>
           <w:rStyle w:val="VerbatimChar"/>
         </w:rPr>
-        <w:t xml:space="preserve">sqmt</w:t>
+        <w:t xml:space="preserve">FloorArea</w:t>
       </w:r>
       <w:r>
         <w:t xml:space="preserve"> </w:t>
@@ -6739,7 +6726,7 @@
         <w:rPr>
           <w:rStyle w:val="VerbatimChar"/>
         </w:rPr>
-        <w:t xml:space="preserve">price</w:t>
+        <w:t xml:space="preserve">Price</w:t>
       </w:r>
       <w:r>
         <w:t xml:space="preserve">, and</w:t>
@@ -6751,7 +6738,7 @@
         <w:rPr>
           <w:rStyle w:val="VerbatimChar"/>
         </w:rPr>
-        <w:t xml:space="preserve">sqmt</w:t>
+        <w:t xml:space="preserve">FloorArea</w:t>
       </w:r>
       <w:r>
         <w:t xml:space="preserve"> </w:t>
@@ -6766,7 +6753,7 @@
         <w:rPr>
           <w:rStyle w:val="VerbatimChar"/>
         </w:rPr>
-        <w:t xml:space="preserve">tax</w:t>
+        <w:t xml:space="preserve">Tax</w:t>
       </w:r>
       <w:r>
         <w:t xml:space="preserve"> </w:t>
@@ -6781,7 +6768,7 @@
         <w:rPr>
           <w:rStyle w:val="VerbatimChar"/>
         </w:rPr>
-        <w:t xml:space="preserve">price</w:t>
+        <w:t xml:space="preserve">Price</w:t>
       </w:r>
       <w:r>
         <w:t xml:space="preserve">, etc. So according to this DAG, if a landlord increased the square meters of their property it will have lots of</w:t>
@@ -6811,13 +6798,13 @@
         <w:rPr>
           <w:rStyle w:val="VerbatimChar"/>
         </w:rPr>
-        <w:t xml:space="preserve">sqmt</w:t>
-      </w:r>
-      <w:r>
-        <w:t xml:space="preserve"> </w:t>
-      </w:r>
-      <w:r>
-        <w:t xml:space="preserve">will increase how many rooms you have, resulting in a higher listing price. These are all</w:t>
+        <w:t xml:space="preserve">FloorArea</w:t>
+      </w:r>
+      <w:r>
+        <w:t xml:space="preserve"> </w:t>
+      </w:r>
+      <w:r>
+        <w:t xml:space="preserve">will increase how many rooms you have, resulting in a higher listing Price. These are all</w:t>
       </w:r>
       <w:r>
         <w:t xml:space="preserve"> </w:t>
@@ -6918,7 +6905,7 @@
         <w:rPr>
           <w:rStyle w:val="VerbatimChar"/>
         </w:rPr>
-        <w:t xml:space="preserve">sqmt</w:t>
+        <w:t xml:space="preserve">FloorArea</w:t>
       </w:r>
       <w:r>
         <w:t xml:space="preserve"> </w:t>
@@ -6949,7 +6936,7 @@
         <w:rPr>
           <w:rStyle w:val="VerbatimChar"/>
         </w:rPr>
-        <w:t xml:space="preserve">price</w:t>
+        <w:t xml:space="preserve">Price</w:t>
       </w:r>
       <w:r>
         <w:t xml:space="preserve"> </w:t>
@@ -6980,7 +6967,7 @@
         <w:rPr>
           <w:rStyle w:val="VerbatimChar"/>
         </w:rPr>
-        <w:t xml:space="preserve">sqmt</w:t>
+        <w:t xml:space="preserve">FloorArea</w:t>
       </w:r>
       <w:r>
         <w:t xml:space="preserve">. If we’ve increased the square meters of a property, and that results in an extra room, isn’t that part of how</w:t>
@@ -6992,7 +6979,7 @@
         <w:rPr>
           <w:rStyle w:val="VerbatimChar"/>
         </w:rPr>
-        <w:t xml:space="preserve">sqmt</w:t>
+        <w:t xml:space="preserve">FloorArea</w:t>
       </w:r>
       <w:r>
         <w:t xml:space="preserve"> </w:t>
@@ -7007,7 +6994,7 @@
         <w:rPr>
           <w:rStyle w:val="VerbatimChar"/>
         </w:rPr>
-        <w:t xml:space="preserve">price</w:t>
+        <w:t xml:space="preserve">Price</w:t>
       </w:r>
       <w:r>
         <w:t xml:space="preserve"> </w:t>
@@ -7038,7 +7025,7 @@
         <w:rPr>
           <w:rStyle w:val="VerbatimChar"/>
         </w:rPr>
-        <w:t xml:space="preserve">sqmt</w:t>
+        <w:t xml:space="preserve">FloorArea</w:t>
       </w:r>
       <w:r>
         <w:t xml:space="preserve"> </w:t>
@@ -7053,7 +7040,7 @@
         <w:rPr>
           <w:rStyle w:val="VerbatimChar"/>
         </w:rPr>
-        <w:t xml:space="preserve">price</w:t>
+        <w:t xml:space="preserve">Price</w:t>
       </w:r>
       <w:r>
         <w:t xml:space="preserve"> </w:t>
@@ -7076,7 +7063,7 @@
         <w:rPr>
           <w:rStyle w:val="NormalTok"/>
         </w:rPr>
-        <w:t xml:space="preserve">(price </w:t>
+        <w:t xml:space="preserve">(Price </w:t>
       </w:r>
       <w:r>
         <w:rPr>
@@ -7088,7 +7075,7 @@
         <w:rPr>
           <w:rStyle w:val="NormalTok"/>
         </w:rPr>
-        <w:t xml:space="preserve"> sqmt, </w:t>
+        <w:t xml:space="preserve"> FloorArea, </w:t>
       </w:r>
       <w:r>
         <w:rPr>
@@ -7108,7 +7095,7 @@
         <w:pStyle w:val="BlockText"/>
       </w:pPr>
       <w:r>
-        <w:t xml:space="preserve">Note that it won’t always work out that to understand the causal effect of X on Y requires the model Y ~ X. In fact, most of the time it doesn’t. It’s just that according to this particular DAG, to understand sqmt on price we would run the model price ~ sqmt.</w:t>
+        <w:t xml:space="preserve">Note that it won’t always work out that to understand the causal effect of X on Y requires the model Y ~ X. In fact, most of the time it doesn’t. It’s just that according to this particular DAG, to understand FloorArea on Price we would run the model Price ~ FloorArea.</w:t>
       </w:r>
     </w:p>
     <w:p>
@@ -7162,16 +7149,16 @@
         <w:rPr>
           <w:rStyle w:val="VerbatimChar"/>
         </w:rPr>
-        <w:t xml:space="preserve">## - Outcome: price</w:t>
-      </w:r>
-      <w:r>
-        <w:br/>
-      </w:r>
-      <w:r>
-        <w:rPr>
-          <w:rStyle w:val="VerbatimChar"/>
-        </w:rPr>
-        <w:t xml:space="preserve">## - Exposure: sqmt</w:t>
+        <w:t xml:space="preserve">## - Outcome: Price</w:t>
+      </w:r>
+      <w:r>
+        <w:br/>
+      </w:r>
+      <w:r>
+        <w:rPr>
+          <w:rStyle w:val="VerbatimChar"/>
+        </w:rPr>
+        <w:t xml:space="preserve">## - Exposure: FloorArea</w:t>
       </w:r>
       <w:r>
         <w:br/>
@@ -7216,16 +7203,7 @@
         <w:rPr>
           <w:rStyle w:val="VerbatimChar"/>
         </w:rPr>
-        <w:t xml:space="preserve">## To estimate the direct effect, at least adjust for `epc`, `rooms` and `tax`.</w:t>
-      </w:r>
-      <w:r>
-        <w:br/>
-      </w:r>
-      <w:r>
-        <w:rPr>
-          <w:rStyle w:val="VerbatimChar"/>
-        </w:rPr>
-        <w:t xml:space="preserve">## Currently, the model does not adjust for any variables.</w:t>
+        <w:t xml:space="preserve">## To estimate the direct effect, at least adjust for `EPC`, `Tax` and `rooms`. Currently, the model does not adjust for any variables.</w:t>
       </w:r>
       <w:r>
         <w:br/>
@@ -7270,7 +7248,7 @@
         <w:rPr>
           <w:rStyle w:val="VerbatimChar"/>
         </w:rPr>
-        <w:t xml:space="preserve">## No adjustment needed to estimate the total effect of `sqmt` on `price`.</w:t>
+        <w:t xml:space="preserve">## No adjustment needed to estimate the total effect of `FloorArea` on `Price`.</w:t>
       </w:r>
     </w:p>
     <w:p>
@@ -7311,7 +7289,7 @@
         <w:rPr>
           <w:rStyle w:val="VerbatimChar"/>
         </w:rPr>
-        <w:t xml:space="preserve">sqmt</w:t>
+        <w:t xml:space="preserve">FloorArea</w:t>
       </w:r>
       <w:r>
         <w:t xml:space="preserve"> </w:t>
@@ -7326,7 +7304,7 @@
         <w:rPr>
           <w:rStyle w:val="VerbatimChar"/>
         </w:rPr>
-        <w:t xml:space="preserve">price</w:t>
+        <w:t xml:space="preserve">Price</w:t>
       </w:r>
       <w:r>
         <w:t xml:space="preserve">, we would also need to include EPC and Rooms, but we aren’t interested in just the direct effect. For clarity, the</w:t>
@@ -7345,22 +7323,22 @@
         <w:t xml:space="preserve"> </w:t>
       </w:r>
       <w:r>
-        <w:t xml:space="preserve">effect would be the effect of adding extra square meters to a property not including the fact that this will likely influence the number of rooms, the EPC, the tax band, etc. Instead, based on our research question we want to understand what would happen to</w:t>
-      </w:r>
-      <w:r>
-        <w:t xml:space="preserve"> </w:t>
-      </w:r>
-      <w:r>
-        <w:rPr>
-          <w:rStyle w:val="VerbatimChar"/>
-        </w:rPr>
-        <w:t xml:space="preserve">price</w:t>
-      </w:r>
-      <w:r>
-        <w:t xml:space="preserve"> </w:t>
-      </w:r>
-      <w:r>
-        <w:t xml:space="preserve">if we increased a property by, say, 10 square meters, and all the different ways those extra 10 m result in a change in price. So we want the</w:t>
+        <w:t xml:space="preserve">effect would be the effect of adding extra square meters to a property not including the fact that this will likely influence the number of rooms, the EPC, the Tax band, etc. Instead, based on our research question we want to understand what would happen to</w:t>
+      </w:r>
+      <w:r>
+        <w:t xml:space="preserve"> </w:t>
+      </w:r>
+      <w:r>
+        <w:rPr>
+          <w:rStyle w:val="VerbatimChar"/>
+        </w:rPr>
+        <w:t xml:space="preserve">Price</w:t>
+      </w:r>
+      <w:r>
+        <w:t xml:space="preserve"> </w:t>
+      </w:r>
+      <w:r>
+        <w:t xml:space="preserve">if we increased a property by, say, 10 square meters, and all the different ways those extra 10 m result in a change in Price. So we want the</w:t>
       </w:r>
       <w:r>
         <w:t xml:space="preserve"> </w:t>
@@ -7400,7 +7378,7 @@
         <w:rPr>
           <w:rStyle w:val="VerbatimChar"/>
         </w:rPr>
-        <w:t xml:space="preserve">price ~ sqmt</w:t>
+        <w:t xml:space="preserve">Price ~ FloorArea</w:t>
       </w:r>
       <w:r>
         <w:t xml:space="preserve">.</w:t>
@@ -7456,7 +7434,7 @@
         <w:rPr>
           <w:rStyle w:val="NormalTok"/>
         </w:rPr>
-        <w:t xml:space="preserve">(price </w:t>
+        <w:t xml:space="preserve">(Price </w:t>
       </w:r>
       <w:r>
         <w:rPr>
@@ -7468,7 +7446,7 @@
         <w:rPr>
           <w:rStyle w:val="NormalTok"/>
         </w:rPr>
-        <w:t xml:space="preserve"> sqmt, </w:t>
+        <w:t xml:space="preserve"> FloorArea, </w:t>
       </w:r>
       <w:r>
         <w:rPr>
@@ -7770,7 +7748,7 @@
         <w:rPr>
           <w:rStyle w:val="VerbatimChar"/>
         </w:rPr>
-        <w:t xml:space="preserve">## lm(formula = price ~ sqmt, data = abdn_trimmed)</w:t>
+        <w:t xml:space="preserve">## lm(formula = Price ~ FloorArea, data = abdn_trimmed)</w:t>
       </w:r>
       <w:r>
         <w:br/>
@@ -7806,7 +7784,7 @@
         <w:rPr>
           <w:rStyle w:val="VerbatimChar"/>
         </w:rPr>
-        <w:t xml:space="preserve">## -407.05  -68.75  -10.51   67.35  793.52 </w:t>
+        <w:t xml:space="preserve">## -891.54 -101.55   -4.69   77.69 1346.26 </w:t>
       </w:r>
       <w:r>
         <w:br/>
@@ -7842,16 +7820,16 @@
         <w:rPr>
           <w:rStyle w:val="VerbatimChar"/>
         </w:rPr>
-        <w:t xml:space="preserve">## (Intercept) 231.1144    31.7002   7.291 2.02e-11 ***</w:t>
-      </w:r>
-      <w:r>
-        <w:br/>
-      </w:r>
-      <w:r>
-        <w:rPr>
-          <w:rStyle w:val="VerbatimChar"/>
-        </w:rPr>
-        <w:t xml:space="preserve">## sqmt          8.5205     0.4037  21.104  &lt; 2e-16 ***</w:t>
+        <w:t xml:space="preserve">## (Intercept) 230.5015    25.1170   9.177   &lt;2e-16 ***</w:t>
+      </w:r>
+      <w:r>
+        <w:br/>
+      </w:r>
+      <w:r>
+        <w:rPr>
+          <w:rStyle w:val="VerbatimChar"/>
+        </w:rPr>
+        <w:t xml:space="preserve">## FloorArea     7.9236     0.2945  26.909   &lt;2e-16 ***</w:t>
       </w:r>
       <w:r>
         <w:br/>
@@ -7887,25 +7865,25 @@
         <w:rPr>
           <w:rStyle w:val="VerbatimChar"/>
         </w:rPr>
-        <w:t xml:space="preserve">## Residual standard error: 158 on 141 degrees of freedom</w:t>
-      </w:r>
-      <w:r>
-        <w:br/>
-      </w:r>
-      <w:r>
-        <w:rPr>
-          <w:rStyle w:val="VerbatimChar"/>
-        </w:rPr>
-        <w:t xml:space="preserve">## Multiple R-squared:  0.7595, Adjusted R-squared:  0.7578 </w:t>
-      </w:r>
-      <w:r>
-        <w:br/>
-      </w:r>
-      <w:r>
-        <w:rPr>
-          <w:rStyle w:val="VerbatimChar"/>
-        </w:rPr>
-        <w:t xml:space="preserve">## F-statistic: 445.4 on 1 and 141 DF,  p-value: &lt; 2.2e-16</w:t>
+        <w:t xml:space="preserve">## Residual standard error: 224.2 on 423 degrees of freedom</w:t>
+      </w:r>
+      <w:r>
+        <w:br/>
+      </w:r>
+      <w:r>
+        <w:rPr>
+          <w:rStyle w:val="VerbatimChar"/>
+        </w:rPr>
+        <w:t xml:space="preserve">## Multiple R-squared:  0.6312, Adjusted R-squared:  0.6304 </w:t>
+      </w:r>
+      <w:r>
+        <w:br/>
+      </w:r>
+      <w:r>
+        <w:rPr>
+          <w:rStyle w:val="VerbatimChar"/>
+        </w:rPr>
+        <w:t xml:space="preserve">## F-statistic: 724.1 on 1 and 423 DF,  p-value: &lt; 2.2e-16</w:t>
       </w:r>
     </w:p>
     <w:p>
@@ -7963,7 +7941,7 @@
         <w:rPr>
           <w:rStyle w:val="AttributeTok"/>
         </w:rPr>
-        <w:t xml:space="preserve">sqmt =</w:t>
+        <w:t xml:space="preserve">FloorArea =</w:t>
       </w:r>
       <w:r>
         <w:rPr>
@@ -8017,7 +7995,7 @@
         <w:rPr>
           <w:rStyle w:val="NormalTok"/>
         </w:rPr>
-        <w:t xml:space="preserve">sqmt), </w:t>
+        <w:t xml:space="preserve">FloorArea), </w:t>
       </w:r>
       <w:r>
         <w:rPr>
@@ -8053,7 +8031,7 @@
         <w:rPr>
           <w:rStyle w:val="NormalTok"/>
         </w:rPr>
-        <w:t xml:space="preserve">sqmt), </w:t>
+        <w:t xml:space="preserve">FloorArea), </w:t>
       </w:r>
       <w:r>
         <w:rPr>
@@ -8440,7 +8418,7 @@
         <w:rPr>
           <w:rStyle w:val="NormalTok"/>
         </w:rPr>
-        <w:t xml:space="preserve"> sqmt, </w:t>
+        <w:t xml:space="preserve"> FloorArea, </w:t>
       </w:r>
       <w:r>
         <w:rPr>
@@ -8563,7 +8541,7 @@
         <w:rPr>
           <w:rStyle w:val="NormalTok"/>
         </w:rPr>
-        <w:t xml:space="preserve"> sqmt, </w:t>
+        <w:t xml:space="preserve"> FloorArea, </w:t>
       </w:r>
       <w:r>
         <w:rPr>
@@ -8759,7 +8737,7 @@
         <w:t xml:space="preserve"> </w:t>
       </w:r>
       <w:r>
-        <w:t xml:space="preserve">the rent increases by roughly £8.50. So long as we assume that our DAG is accurate (a potentially big assumption), this £8.50 increase is the</w:t>
+        <w:t xml:space="preserve">the rent increases by roughly £7.90. So long as we assume that our DAG is accurate (a potentially big assumption), this £7.90 increase is the</w:t>
       </w:r>
       <w:r>
         <w:t xml:space="preserve"> </w:t>
@@ -8801,7 +8779,7 @@
         <w:t xml:space="preserve"> </w:t>
       </w:r>
       <w:r>
-        <w:t xml:space="preserve">an extra square meter to a property would increase the price by £2.30. At the time, we noted that £2.30 seemed on the</w:t>
+        <w:t xml:space="preserve">an extra square meter to a property would increase the Price by £0.51. At the time, we noted that £0.51 seemed on the</w:t>
       </w:r>
       <w:r>
         <w:t xml:space="preserve"> </w:t>
@@ -8868,7 +8846,7 @@
         <w:pStyle w:val="Heading1"/>
       </w:pPr>
       <w:r>
-        <w:t xml:space="preserve">What is the causal effect of EPC on price?</w:t>
+        <w:t xml:space="preserve">What is the causal effect of EPC on Price?</w:t>
       </w:r>
     </w:p>
     <w:p>
@@ -8876,7 +8854,7 @@
         <w:pStyle w:val="FirstParagraph"/>
       </w:pPr>
       <w:r>
-        <w:t xml:space="preserve">Repeat the above process, but where our research question is focused on understanding the causal effect of EPC on price.</w:t>
+        <w:t xml:space="preserve">Repeat the above process, but where our research question is focused on understanding the causal effect of EPC on Price.</w:t>
       </w:r>
     </w:p>
     <w:p>
@@ -8937,7 +8915,7 @@
         <w:rPr>
           <w:rStyle w:val="NormalTok"/>
         </w:rPr>
-        <w:t xml:space="preserve">  price </w:t>
+        <w:t xml:space="preserve">  Price </w:t>
       </w:r>
       <w:r>
         <w:rPr>
@@ -8961,7 +8939,7 @@
         <w:rPr>
           <w:rStyle w:val="NormalTok"/>
         </w:rPr>
-        <w:t xml:space="preserve"> sqmt </w:t>
+        <w:t xml:space="preserve"> FloorArea </w:t>
       </w:r>
       <w:r>
         <w:rPr>
@@ -8973,7 +8951,7 @@
         <w:rPr>
           <w:rStyle w:val="NormalTok"/>
         </w:rPr>
-        <w:t xml:space="preserve"> tax </w:t>
+        <w:t xml:space="preserve"> Tax </w:t>
       </w:r>
       <w:r>
         <w:rPr>
@@ -8985,7 +8963,7 @@
         <w:rPr>
           <w:rStyle w:val="NormalTok"/>
         </w:rPr>
-        <w:t xml:space="preserve"> epc,</w:t>
+        <w:t xml:space="preserve"> EPC,</w:t>
       </w:r>
       <w:r>
         <w:br/>
@@ -9006,16 +8984,16 @@
         <w:rPr>
           <w:rStyle w:val="NormalTok"/>
         </w:rPr>
-        <w:t xml:space="preserve"> sqmt,</w:t>
-      </w:r>
-      <w:r>
-        <w:br/>
-      </w:r>
-      <w:r>
-        <w:rPr>
-          <w:rStyle w:val="NormalTok"/>
-        </w:rPr>
-        <w:t xml:space="preserve">  epc </w:t>
+        <w:t xml:space="preserve"> FloorArea,</w:t>
+      </w:r>
+      <w:r>
+        <w:br/>
+      </w:r>
+      <w:r>
+        <w:rPr>
+          <w:rStyle w:val="NormalTok"/>
+        </w:rPr>
+        <w:t xml:space="preserve">  EPC </w:t>
       </w:r>
       <w:r>
         <w:rPr>
@@ -9027,16 +9005,16 @@
         <w:rPr>
           <w:rStyle w:val="NormalTok"/>
         </w:rPr>
-        <w:t xml:space="preserve"> sqmt,</w:t>
-      </w:r>
-      <w:r>
-        <w:br/>
-      </w:r>
-      <w:r>
-        <w:rPr>
-          <w:rStyle w:val="NormalTok"/>
-        </w:rPr>
-        <w:t xml:space="preserve">  tax </w:t>
+        <w:t xml:space="preserve"> FloorArea,</w:t>
+      </w:r>
+      <w:r>
+        <w:br/>
+      </w:r>
+      <w:r>
+        <w:rPr>
+          <w:rStyle w:val="NormalTok"/>
+        </w:rPr>
+        <w:t xml:space="preserve">  Tax </w:t>
       </w:r>
       <w:r>
         <w:rPr>
@@ -9048,7 +9026,7 @@
         <w:rPr>
           <w:rStyle w:val="NormalTok"/>
         </w:rPr>
-        <w:t xml:space="preserve"> sqmt,</w:t>
+        <w:t xml:space="preserve"> FloorArea,</w:t>
       </w:r>
       <w:r>
         <w:br/>
@@ -9075,7 +9053,7 @@
         <w:rPr>
           <w:rStyle w:val="StringTok"/>
         </w:rPr>
-        <w:t xml:space="preserve">"epc"</w:t>
+        <w:t xml:space="preserve">"EPC"</w:t>
       </w:r>
       <w:r>
         <w:rPr>
@@ -9108,7 +9086,7 @@
         <w:rPr>
           <w:rStyle w:val="StringTok"/>
         </w:rPr>
-        <w:t xml:space="preserve">"price"</w:t>
+        <w:t xml:space="preserve">"Price"</w:t>
       </w:r>
       <w:r>
         <w:br/>
@@ -9138,16 +9116,16 @@
         <w:rPr>
           <w:rStyle w:val="CommentTok"/>
         </w:rPr>
-        <w:t xml:space="preserve"># To estimate the causal effect of EPC, we need to include sqmt in the model:</w:t>
-      </w:r>
-      <w:r>
-        <w:br/>
-      </w:r>
-      <w:r>
-        <w:rPr>
-          <w:rStyle w:val="NormalTok"/>
-        </w:rPr>
-        <w:t xml:space="preserve">epc_mod </w:t>
+        <w:t xml:space="preserve"># To estimate the causal effect of EPC, we need to include FloorArea in the model:</w:t>
+      </w:r>
+      <w:r>
+        <w:br/>
+      </w:r>
+      <w:r>
+        <w:rPr>
+          <w:rStyle w:val="NormalTok"/>
+        </w:rPr>
+        <w:t xml:space="preserve">EPC_mod </w:t>
       </w:r>
       <w:r>
         <w:rPr>
@@ -9171,7 +9149,7 @@
         <w:rPr>
           <w:rStyle w:val="NormalTok"/>
         </w:rPr>
-        <w:t xml:space="preserve">(price </w:t>
+        <w:t xml:space="preserve">(Price </w:t>
       </w:r>
       <w:r>
         <w:rPr>
@@ -9183,7 +9161,7 @@
         <w:rPr>
           <w:rStyle w:val="NormalTok"/>
         </w:rPr>
-        <w:t xml:space="preserve"> epc </w:t>
+        <w:t xml:space="preserve"> EPC </w:t>
       </w:r>
       <w:r>
         <w:rPr>
@@ -9195,7 +9173,7 @@
         <w:rPr>
           <w:rStyle w:val="NormalTok"/>
         </w:rPr>
-        <w:t xml:space="preserve"> sqmt, </w:t>
+        <w:t xml:space="preserve"> FloorArea, </w:t>
       </w:r>
       <w:r>
         <w:rPr>
@@ -9231,7 +9209,7 @@
         <w:rPr>
           <w:rStyle w:val="NormalTok"/>
         </w:rPr>
-        <w:t xml:space="preserve">(epc_mod) </w:t>
+        <w:t xml:space="preserve">(EPC_mod) </w:t>
       </w:r>
       <w:r>
         <w:rPr>
@@ -9252,7 +9230,7 @@
         <w:rPr>
           <w:rStyle w:val="NormalTok"/>
         </w:rPr>
-        <w:t xml:space="preserve">(epc_mod)</w:t>
+        <w:t xml:space="preserve">(EPC_mod)</w:t>
       </w:r>
       <w:r>
         <w:br/>
@@ -9279,7 +9257,7 @@
         <w:rPr>
           <w:rStyle w:val="NormalTok"/>
         </w:rPr>
-        <w:t xml:space="preserve">(epc_mod, </w:t>
+        <w:t xml:space="preserve">(EPC_mod, </w:t>
       </w:r>
       <w:r>
         <w:rPr>
@@ -9297,7 +9275,7 @@
         <w:rPr>
           <w:rStyle w:val="StringTok"/>
         </w:rPr>
-        <w:t xml:space="preserve">"epc"</w:t>
+        <w:t xml:space="preserve">"EPC"</w:t>
       </w:r>
       <w:r>
         <w:rPr>
@@ -9324,7 +9302,7 @@
         <w:rPr>
           <w:rStyle w:val="CommentTok"/>
         </w:rPr>
-        <w:t xml:space="preserve"># Note that we do not interpret sqmt in this model. sqmt is included simply to deal with confounded relationships, so under this version of the model is it now confounded. If we did interpret sqmt from this model we would be falling into the "Table 2 Fallacy".</w:t>
+        <w:t xml:space="preserve"># Note that we do not interpret FloorArea in this model. FloorArea is included simply to deal with confounded relationships, so under this version of the model is it now confounded. If we did interpret FloorArea from this model we would be falling into the "Table 2 Fallacy".</w:t>
       </w:r>
       <w:r>
         <w:br/>
@@ -9402,7 +9380,7 @@
         <w:rPr>
           <w:rStyle w:val="NormalTok"/>
         </w:rPr>
-        <w:t xml:space="preserve"> Sqmt </w:t>
+        <w:t xml:space="preserve"> FloorArea </w:t>
       </w:r>
       <w:r>
         <w:rPr>
@@ -9459,7 +9437,7 @@
         <w:rPr>
           <w:rStyle w:val="NormalTok"/>
         </w:rPr>
-        <w:t xml:space="preserve"> Sqmt </w:t>
+        <w:t xml:space="preserve"> FloorArea </w:t>
       </w:r>
       <w:r>
         <w:rPr>
@@ -9492,7 +9470,7 @@
         <w:rPr>
           <w:rStyle w:val="NormalTok"/>
         </w:rPr>
-        <w:t xml:space="preserve"> Sqmt </w:t>
+        <w:t xml:space="preserve"> FloorArea </w:t>
       </w:r>
       <w:r>
         <w:rPr>
@@ -9582,16 +9560,16 @@
         <w:rPr>
           <w:rStyle w:val="NormalTok"/>
         </w:rPr>
-        <w:t xml:space="preserve"> Sqmt,</w:t>
-      </w:r>
-      <w:r>
-        <w:br/>
-      </w:r>
-      <w:r>
-        <w:rPr>
-          <w:rStyle w:val="NormalTok"/>
-        </w:rPr>
-        <w:t xml:space="preserve">  Sqmt </w:t>
+        <w:t xml:space="preserve"> FloorArea,</w:t>
+      </w:r>
+      <w:r>
+        <w:br/>
+      </w:r>
+      <w:r>
+        <w:rPr>
+          <w:rStyle w:val="NormalTok"/>
+        </w:rPr>
+        <w:t xml:space="preserve">  FloorArea </w:t>
       </w:r>
       <w:r>
         <w:rPr>
@@ -9735,7 +9713,7 @@
         <w:rPr>
           <w:rStyle w:val="CommentTok"/>
         </w:rPr>
-        <w:t xml:space="preserve"># Rent ~ EPC + PropertyType + Rooms + Sqmt + Tax</w:t>
+        <w:t xml:space="preserve"># Rent ~ EPC + PropertyType + Rooms + FloorArea + Tax</w:t>
       </w:r>
       <w:r>
         <w:br/>
@@ -9744,7 +9722,7 @@
         <w:rPr>
           <w:rStyle w:val="CommentTok"/>
         </w:rPr>
-        <w:t xml:space="preserve"># Rent ~ EPC + HistoricPrice + PropertyType + Rooms + Sqmt</w:t>
+        <w:t xml:space="preserve"># Rent ~ EPC + HistoricPrice + PropertyType + Rooms + FloorArea</w:t>
       </w:r>
       <w:r>
         <w:br/>
@@ -9753,7 +9731,7 @@
         <w:rPr>
           <w:rStyle w:val="CommentTok"/>
         </w:rPr>
-        <w:t xml:space="preserve"># Rent ~ EPC + PropertyAge + Sqmt</w:t>
+        <w:t xml:space="preserve"># Rent ~ EPC + PropertyAge + FloorArea</w:t>
       </w:r>
       <w:r>
         <w:br/>
@@ -9765,7 +9743,7 @@
         <w:rPr>
           <w:rStyle w:val="CommentTok"/>
         </w:rPr>
-        <w:t xml:space="preserve"># The easiest of which would be the first, given PropertyType is the easiest variable to collect (property age is difficult, and historic price may well beimpossible to get). The means that unless we get PropertyType, we can't currently understand the causal effect of EPC with the data as is. This is a nice example of where doing the DAG *before* data collection helps to prevent headaches later on by identifying which variables to collect!</w:t>
+        <w:t xml:space="preserve"># The easiest of which would be the first, given PropertyType is the easiest variable to collect (property age is difficult, and historic Price may well beimpossible to get). The means that unless we get PropertyType, we can't currently understand the causal effect of EPC with the data as is. This is a nice example of where doing the DAG *before* data collection helps to prevent headaches later on by identifying which variables to collect!</w:t>
       </w:r>
     </w:p>
     <w:bookmarkEnd w:id="75"/>

</xml_diff>

<commit_message>
Adapted to be less context dependent advice on data/assumption issues. moved beta_dag to after corrected model
</commit_message>
<xml_diff>
--- a/Workshops/Workshop 7 - LM with multiple predictors/Workshop-7---LM-with-multiple-predictors--with-answers-.docx
+++ b/Workshops/Workshop 7 - LM with multiple predictors/Workshop-7---LM-with-multiple-predictors--with-answers-.docx
@@ -95,7 +95,7 @@
         <w:t xml:space="preserve"> </w:t>
       </w:r>
       <w:r>
-        <w:t xml:space="preserve">2025-08-25</w:t>
+        <w:t xml:space="preserve">2025-09-09</w:t>
       </w:r>
     </w:p>
     <w:sdt>
@@ -2486,7 +2486,7 @@
         <w:rPr>
           <w:rStyle w:val="VerbatimChar"/>
         </w:rPr>
-        <w:t xml:space="preserve">## -557.96  -85.22   -3.85   61.64  973.67 </w:t>
+        <w:t xml:space="preserve">## -550.48  -83.99   -0.61   62.54  965.94 </w:t>
       </w:r>
       <w:r>
         <w:br/>
@@ -2522,142 +2522,142 @@
         <w:rPr>
           <w:rStyle w:val="VerbatimChar"/>
         </w:rPr>
-        <w:t xml:space="preserve">## (Intercept)  290.3394   125.8764   2.307  0.02145 *  </w:t>
-      </w:r>
-      <w:r>
-        <w:br/>
-      </w:r>
-      <w:r>
-        <w:rPr>
-          <w:rStyle w:val="VerbatimChar"/>
-        </w:rPr>
-        <w:t xml:space="preserve">## FloorArea      0.8009     0.4515   1.774  0.07664 .  </w:t>
-      </w:r>
-      <w:r>
-        <w:br/>
-      </w:r>
-      <w:r>
-        <w:rPr>
-          <w:rStyle w:val="VerbatimChar"/>
-        </w:rPr>
-        <w:t xml:space="preserve">## Rooms        115.8136    12.3778   9.357  &lt; 2e-16 ***</w:t>
-      </w:r>
-      <w:r>
-        <w:br/>
-      </w:r>
-      <w:r>
-        <w:rPr>
-          <w:rStyle w:val="VerbatimChar"/>
-        </w:rPr>
-        <w:t xml:space="preserve">## EPCB         111.0214   124.9432   0.889  0.37462    </w:t>
-      </w:r>
-      <w:r>
-        <w:br/>
-      </w:r>
-      <w:r>
-        <w:rPr>
-          <w:rStyle w:val="VerbatimChar"/>
-        </w:rPr>
-        <w:t xml:space="preserve">## EPCC         -15.9148   123.1390  -0.129  0.89721    </w:t>
-      </w:r>
-      <w:r>
-        <w:br/>
-      </w:r>
-      <w:r>
-        <w:rPr>
-          <w:rStyle w:val="VerbatimChar"/>
-        </w:rPr>
-        <w:t xml:space="preserve">## EPCD         -46.1560   123.1773  -0.375  0.70802    </w:t>
-      </w:r>
-      <w:r>
-        <w:br/>
-      </w:r>
-      <w:r>
-        <w:rPr>
-          <w:rStyle w:val="VerbatimChar"/>
-        </w:rPr>
-        <w:t xml:space="preserve">## EPCE         -99.0179   124.4600  -0.796  0.42662    </w:t>
-      </w:r>
-      <w:r>
-        <w:br/>
-      </w:r>
-      <w:r>
-        <w:rPr>
-          <w:rStyle w:val="VerbatimChar"/>
-        </w:rPr>
-        <w:t xml:space="preserve">## EPCF        -157.4728   137.4112  -1.146  0.25229    </w:t>
-      </w:r>
-      <w:r>
-        <w:br/>
-      </w:r>
-      <w:r>
-        <w:rPr>
-          <w:rStyle w:val="VerbatimChar"/>
-        </w:rPr>
-        <w:t xml:space="preserve">## EPCG         -47.8461   212.3494  -0.225  0.82182    </w:t>
-      </w:r>
-      <w:r>
-        <w:br/>
-      </w:r>
-      <w:r>
-        <w:rPr>
-          <w:rStyle w:val="VerbatimChar"/>
-        </w:rPr>
-        <w:t xml:space="preserve">## TaxB          15.7688    24.4794   0.644  0.51973    </w:t>
-      </w:r>
-      <w:r>
-        <w:br/>
-      </w:r>
-      <w:r>
-        <w:rPr>
-          <w:rStyle w:val="VerbatimChar"/>
-        </w:rPr>
-        <w:t xml:space="preserve">## TaxC          71.6397    25.5576   2.803  0.00524 ** </w:t>
-      </w:r>
-      <w:r>
-        <w:br/>
-      </w:r>
-      <w:r>
-        <w:rPr>
-          <w:rStyle w:val="VerbatimChar"/>
-        </w:rPr>
-        <w:t xml:space="preserve">## TaxD         121.3152    25.6055   4.738 2.75e-06 ***</w:t>
-      </w:r>
-      <w:r>
-        <w:br/>
-      </w:r>
-      <w:r>
-        <w:rPr>
-          <w:rStyle w:val="VerbatimChar"/>
-        </w:rPr>
-        <w:t xml:space="preserve">## TaxE         210.8661    32.2362   6.541 1.39e-10 ***</w:t>
-      </w:r>
-      <w:r>
-        <w:br/>
-      </w:r>
-      <w:r>
-        <w:rPr>
-          <w:rStyle w:val="VerbatimChar"/>
-        </w:rPr>
-        <w:t xml:space="preserve">## TaxF         358.6641    45.3072   7.916 1.34e-14 ***</w:t>
-      </w:r>
-      <w:r>
-        <w:br/>
-      </w:r>
-      <w:r>
-        <w:rPr>
-          <w:rStyle w:val="VerbatimChar"/>
-        </w:rPr>
-        <w:t xml:space="preserve">## TaxG         709.1697    57.6194  12.308  &lt; 2e-16 ***</w:t>
-      </w:r>
-      <w:r>
-        <w:br/>
-      </w:r>
-      <w:r>
-        <w:rPr>
-          <w:rStyle w:val="VerbatimChar"/>
-        </w:rPr>
-        <w:t xml:space="preserve">## TaxH         970.4705   182.6638   5.313 1.57e-07 ***</w:t>
+        <w:t xml:space="preserve">## (Intercept)  287.9191   126.8083   2.271  0.02354 *  </w:t>
+      </w:r>
+      <w:r>
+        <w:br/>
+      </w:r>
+      <w:r>
+        <w:rPr>
+          <w:rStyle w:val="VerbatimChar"/>
+        </w:rPr>
+        <w:t xml:space="preserve">## FloorArea      1.2593     0.4425   2.846  0.00459 ** </w:t>
+      </w:r>
+      <w:r>
+        <w:br/>
+      </w:r>
+      <w:r>
+        <w:rPr>
+          <w:rStyle w:val="VerbatimChar"/>
+        </w:rPr>
+        <w:t xml:space="preserve">## Rooms        109.6151    12.2783   8.928  &lt; 2e-16 ***</w:t>
+      </w:r>
+      <w:r>
+        <w:br/>
+      </w:r>
+      <w:r>
+        <w:rPr>
+          <w:rStyle w:val="VerbatimChar"/>
+        </w:rPr>
+        <w:t xml:space="preserve">## EPCB         120.3630   125.7759   0.957  0.33899    </w:t>
+      </w:r>
+      <w:r>
+        <w:br/>
+      </w:r>
+      <w:r>
+        <w:rPr>
+          <w:rStyle w:val="VerbatimChar"/>
+        </w:rPr>
+        <w:t xml:space="preserve">## EPCC         -17.1116   124.1525  -0.138  0.89042    </w:t>
+      </w:r>
+      <w:r>
+        <w:br/>
+      </w:r>
+      <w:r>
+        <w:rPr>
+          <w:rStyle w:val="VerbatimChar"/>
+        </w:rPr>
+        <w:t xml:space="preserve">## EPCD         -50.7335   124.1552  -0.409  0.68296    </w:t>
+      </w:r>
+      <w:r>
+        <w:br/>
+      </w:r>
+      <w:r>
+        <w:rPr>
+          <w:rStyle w:val="VerbatimChar"/>
+        </w:rPr>
+        <w:t xml:space="preserve">## EPCE        -104.6777   125.4369  -0.835  0.40434    </w:t>
+      </w:r>
+      <w:r>
+        <w:br/>
+      </w:r>
+      <w:r>
+        <w:rPr>
+          <w:rStyle w:val="VerbatimChar"/>
+        </w:rPr>
+        <w:t xml:space="preserve">## EPCF        -144.4606   135.4778  -1.066  0.28673    </w:t>
+      </w:r>
+      <w:r>
+        <w:br/>
+      </w:r>
+      <w:r>
+        <w:rPr>
+          <w:rStyle w:val="VerbatimChar"/>
+        </w:rPr>
+        <w:t xml:space="preserve">## EPCG         -88.7137   175.4481  -0.506  0.61330    </w:t>
+      </w:r>
+      <w:r>
+        <w:br/>
+      </w:r>
+      <w:r>
+        <w:rPr>
+          <w:rStyle w:val="VerbatimChar"/>
+        </w:rPr>
+        <w:t xml:space="preserve">## TaxB          10.1948    24.1533   0.422  0.67312    </w:t>
+      </w:r>
+      <w:r>
+        <w:br/>
+      </w:r>
+      <w:r>
+        <w:rPr>
+          <w:rStyle w:val="VerbatimChar"/>
+        </w:rPr>
+        <w:t xml:space="preserve">## TaxC          66.0662    25.5076   2.590  0.00984 ** </w:t>
+      </w:r>
+      <w:r>
+        <w:br/>
+      </w:r>
+      <w:r>
+        <w:rPr>
+          <w:rStyle w:val="VerbatimChar"/>
+        </w:rPr>
+        <w:t xml:space="preserve">## TaxD         116.0252    25.5256   4.545 6.68e-06 ***</w:t>
+      </w:r>
+      <w:r>
+        <w:br/>
+      </w:r>
+      <w:r>
+        <w:rPr>
+          <w:rStyle w:val="VerbatimChar"/>
+        </w:rPr>
+        <w:t xml:space="preserve">## TaxE         195.2800    31.9291   6.116 1.77e-09 ***</w:t>
+      </w:r>
+      <w:r>
+        <w:br/>
+      </w:r>
+      <w:r>
+        <w:rPr>
+          <w:rStyle w:val="VerbatimChar"/>
+        </w:rPr>
+        <w:t xml:space="preserve">## TaxF         331.9981    45.0399   7.371 5.89e-13 ***</w:t>
+      </w:r>
+      <w:r>
+        <w:br/>
+      </w:r>
+      <w:r>
+        <w:rPr>
+          <w:rStyle w:val="VerbatimChar"/>
+        </w:rPr>
+        <w:t xml:space="preserve">## TaxG         683.0726    56.2103  12.152  &lt; 2e-16 ***</w:t>
+      </w:r>
+      <w:r>
+        <w:br/>
+      </w:r>
+      <w:r>
+        <w:rPr>
+          <w:rStyle w:val="VerbatimChar"/>
+        </w:rPr>
+        <w:t xml:space="preserve">## TaxH         921.4423   183.7291   5.015 7.06e-07 ***</w:t>
       </w:r>
       <w:r>
         <w:br/>
@@ -2693,25 +2693,25 @@
         <w:rPr>
           <w:rStyle w:val="VerbatimChar"/>
         </w:rPr>
-        <w:t xml:space="preserve">## Residual standard error: 172.1 on 554 degrees of freedom</w:t>
-      </w:r>
-      <w:r>
-        <w:br/>
-      </w:r>
-      <w:r>
-        <w:rPr>
-          <w:rStyle w:val="VerbatimChar"/>
-        </w:rPr>
-        <w:t xml:space="preserve">## Multiple R-squared:  0.7925, Adjusted R-squared:  0.7868 </w:t>
-      </w:r>
-      <w:r>
-        <w:br/>
-      </w:r>
-      <w:r>
-        <w:rPr>
-          <w:rStyle w:val="VerbatimChar"/>
-        </w:rPr>
-        <w:t xml:space="preserve">## F-statistic:   141 on 15 and 554 DF,  p-value: &lt; 2.2e-16</w:t>
+        <w:t xml:space="preserve">## Residual standard error: 173.6 on 577 degrees of freedom</w:t>
+      </w:r>
+      <w:r>
+        <w:br/>
+      </w:r>
+      <w:r>
+        <w:rPr>
+          <w:rStyle w:val="VerbatimChar"/>
+        </w:rPr>
+        <w:t xml:space="preserve">## Multiple R-squared:  0.7944, Adjusted R-squared:  0.789 </w:t>
+      </w:r>
+      <w:r>
+        <w:br/>
+      </w:r>
+      <w:r>
+        <w:rPr>
+          <w:rStyle w:val="VerbatimChar"/>
+        </w:rPr>
+        <w:t xml:space="preserve">## F-statistic: 148.6 on 15 and 577 DF,  p-value: &lt; 2.2e-16</w:t>
       </w:r>
     </w:p>
     <w:p>
@@ -2907,7 +2907,7 @@
         <w:rPr>
           <w:rStyle w:val="VerbatimChar"/>
         </w:rPr>
-        <w:t xml:space="preserve">##   324, 534</w:t>
+        <w:t xml:space="preserve">##   324</w:t>
       </w:r>
     </w:p>
     <w:p>
@@ -3578,7 +3578,7 @@
         <w:rPr>
           <w:rStyle w:val="VerbatimChar"/>
         </w:rPr>
-        <w:t xml:space="preserve">##   487, 532</w:t>
+        <w:t xml:space="preserve">##   487</w:t>
       </w:r>
     </w:p>
     <w:p>
@@ -3860,7 +3860,7 @@
         <w:rPr>
           <w:rStyle w:val="VerbatimChar"/>
         </w:rPr>
-        <w:t xml:space="preserve">## -557.90  -85.32   -3.85   61.90  973.65 </w:t>
+        <w:t xml:space="preserve">## -550.42  -84.03   -0.61   62.93  965.91 </w:t>
       </w:r>
       <w:r>
         <w:br/>
@@ -3896,133 +3896,133 @@
         <w:rPr>
           <w:rStyle w:val="VerbatimChar"/>
         </w:rPr>
-        <w:t xml:space="preserve">## (Intercept)  342.7544   175.2243   1.956  0.05096 .  </w:t>
-      </w:r>
-      <w:r>
-        <w:br/>
-      </w:r>
-      <w:r>
-        <w:rPr>
-          <w:rStyle w:val="VerbatimChar"/>
-        </w:rPr>
-        <w:t xml:space="preserve">## FloorArea      0.8030     0.4519   1.777  0.07609 .  </w:t>
-      </w:r>
-      <w:r>
-        <w:br/>
-      </w:r>
-      <w:r>
-        <w:rPr>
-          <w:rStyle w:val="VerbatimChar"/>
-        </w:rPr>
-        <w:t xml:space="preserve">## Rooms        115.7707    12.3873   9.346  &lt; 2e-16 ***</w:t>
-      </w:r>
-      <w:r>
-        <w:br/>
-      </w:r>
-      <w:r>
-        <w:rPr>
-          <w:rStyle w:val="VerbatimChar"/>
-        </w:rPr>
-        <w:t xml:space="preserve">## EPCB          58.5972   174.5690   0.336  0.73725    </w:t>
-      </w:r>
-      <w:r>
-        <w:br/>
-      </w:r>
-      <w:r>
-        <w:rPr>
-          <w:rStyle w:val="VerbatimChar"/>
-        </w:rPr>
-        <w:t xml:space="preserve">## EPCC         -68.3253   173.2579  -0.394  0.69347    </w:t>
-      </w:r>
-      <w:r>
-        <w:br/>
-      </w:r>
-      <w:r>
-        <w:rPr>
-          <w:rStyle w:val="VerbatimChar"/>
-        </w:rPr>
-        <w:t xml:space="preserve">## EPCD         -98.5761   173.3007  -0.569  0.56971    </w:t>
-      </w:r>
-      <w:r>
-        <w:br/>
-      </w:r>
-      <w:r>
-        <w:rPr>
-          <w:rStyle w:val="VerbatimChar"/>
-        </w:rPr>
-        <w:t xml:space="preserve">## EPCE        -151.4388   174.2175  -0.869  0.38509    </w:t>
-      </w:r>
-      <w:r>
-        <w:br/>
-      </w:r>
-      <w:r>
-        <w:rPr>
-          <w:rStyle w:val="VerbatimChar"/>
-        </w:rPr>
-        <w:t xml:space="preserve">## EPCF        -209.9194   183.7466  -1.142  0.25377    </w:t>
-      </w:r>
-      <w:r>
-        <w:br/>
-      </w:r>
-      <w:r>
-        <w:rPr>
-          <w:rStyle w:val="VerbatimChar"/>
-        </w:rPr>
-        <w:t xml:space="preserve">## EPCG        -100.2949   244.9757  -0.409  0.68240    </w:t>
-      </w:r>
-      <w:r>
-        <w:br/>
-      </w:r>
-      <w:r>
-        <w:rPr>
-          <w:rStyle w:val="VerbatimChar"/>
-        </w:rPr>
-        <w:t xml:space="preserve">## TaxB          15.7660    24.4975   0.644  0.52012    </w:t>
-      </w:r>
-      <w:r>
-        <w:br/>
-      </w:r>
-      <w:r>
-        <w:rPr>
-          <w:rStyle w:val="VerbatimChar"/>
-        </w:rPr>
-        <w:t xml:space="preserve">## TaxC          71.6292    25.5764   2.801  0.00528 ** </w:t>
-      </w:r>
-      <w:r>
-        <w:br/>
-      </w:r>
-      <w:r>
-        <w:rPr>
-          <w:rStyle w:val="VerbatimChar"/>
-        </w:rPr>
-        <w:t xml:space="preserve">## TaxD         121.2985    25.6244   4.734 2.80e-06 ***</w:t>
-      </w:r>
-      <w:r>
-        <w:br/>
-      </w:r>
-      <w:r>
-        <w:rPr>
-          <w:rStyle w:val="VerbatimChar"/>
-        </w:rPr>
-        <w:t xml:space="preserve">## TaxE         210.8297    32.2600   6.535 1.44e-10 ***</w:t>
-      </w:r>
-      <w:r>
-        <w:br/>
-      </w:r>
-      <w:r>
-        <w:rPr>
-          <w:rStyle w:val="VerbatimChar"/>
-        </w:rPr>
-        <w:t xml:space="preserve">## TaxF         358.6008    45.3408   7.909 1.42e-14 ***</w:t>
-      </w:r>
-      <w:r>
-        <w:br/>
-      </w:r>
-      <w:r>
-        <w:rPr>
-          <w:rStyle w:val="VerbatimChar"/>
-        </w:rPr>
-        <w:t xml:space="preserve">## TaxG         709.0833    57.6622  12.297  &lt; 2e-16 ***</w:t>
+        <w:t xml:space="preserve">## (Intercept)  341.7095   176.6300   1.935  0.05353 .  </w:t>
+      </w:r>
+      <w:r>
+        <w:br/>
+      </w:r>
+      <w:r>
+        <w:rPr>
+          <w:rStyle w:val="VerbatimChar"/>
+        </w:rPr>
+        <w:t xml:space="preserve">## FloorArea      1.2614     0.4429   2.848  0.00455 ** </w:t>
+      </w:r>
+      <w:r>
+        <w:br/>
+      </w:r>
+      <w:r>
+        <w:rPr>
+          <w:rStyle w:val="VerbatimChar"/>
+        </w:rPr>
+        <w:t xml:space="preserve">## Rooms        109.5730    12.2873   8.918  &lt; 2e-16 ***</w:t>
+      </w:r>
+      <w:r>
+        <w:br/>
+      </w:r>
+      <w:r>
+        <w:rPr>
+          <w:rStyle w:val="VerbatimChar"/>
+        </w:rPr>
+        <w:t xml:space="preserve">## EPCB          66.5610   175.9078   0.378  0.70528    </w:t>
+      </w:r>
+      <w:r>
+        <w:br/>
+      </w:r>
+      <w:r>
+        <w:rPr>
+          <w:rStyle w:val="VerbatimChar"/>
+        </w:rPr>
+        <w:t xml:space="preserve">## EPCC         -70.8969   174.7223  -0.406  0.68506    </w:t>
+      </w:r>
+      <w:r>
+        <w:br/>
+      </w:r>
+      <w:r>
+        <w:rPr>
+          <w:rStyle w:val="VerbatimChar"/>
+        </w:rPr>
+        <w:t xml:space="preserve">## EPCD        -104.5269   174.7372  -0.598  0.54995    </w:t>
+      </w:r>
+      <w:r>
+        <w:br/>
+      </w:r>
+      <w:r>
+        <w:rPr>
+          <w:rStyle w:val="VerbatimChar"/>
+        </w:rPr>
+        <w:t xml:space="preserve">## EPCE        -158.4724   175.6535  -0.902  0.36733    </w:t>
+      </w:r>
+      <w:r>
+        <w:br/>
+      </w:r>
+      <w:r>
+        <w:rPr>
+          <w:rStyle w:val="VerbatimChar"/>
+        </w:rPr>
+        <w:t xml:space="preserve">## EPCF        -198.2739   182.9976  -1.083  0.27905    </w:t>
+      </w:r>
+      <w:r>
+        <w:br/>
+      </w:r>
+      <w:r>
+        <w:rPr>
+          <w:rStyle w:val="VerbatimChar"/>
+        </w:rPr>
+        <w:t xml:space="preserve">## EPCG        -142.5350   214.3310  -0.665  0.50630    </w:t>
+      </w:r>
+      <w:r>
+        <w:br/>
+      </w:r>
+      <w:r>
+        <w:rPr>
+          <w:rStyle w:val="VerbatimChar"/>
+        </w:rPr>
+        <w:t xml:space="preserve">## TaxB          10.1935    24.1703   0.422  0.67338    </w:t>
+      </w:r>
+      <w:r>
+        <w:br/>
+      </w:r>
+      <w:r>
+        <w:rPr>
+          <w:rStyle w:val="VerbatimChar"/>
+        </w:rPr>
+        <w:t xml:space="preserve">## TaxC          66.0565    25.5255   2.588  0.00990 ** </w:t>
+      </w:r>
+      <w:r>
+        <w:br/>
+      </w:r>
+      <w:r>
+        <w:rPr>
+          <w:rStyle w:val="VerbatimChar"/>
+        </w:rPr>
+        <w:t xml:space="preserve">## TaxD         116.0097    25.5436   4.542 6.80e-06 ***</w:t>
+      </w:r>
+      <w:r>
+        <w:br/>
+      </w:r>
+      <w:r>
+        <w:rPr>
+          <w:rStyle w:val="VerbatimChar"/>
+        </w:rPr>
+        <w:t xml:space="preserve">## TaxE         195.2465    31.9516   6.111 1.83e-09 ***</w:t>
+      </w:r>
+      <w:r>
+        <w:br/>
+      </w:r>
+      <w:r>
+        <w:rPr>
+          <w:rStyle w:val="VerbatimChar"/>
+        </w:rPr>
+        <w:t xml:space="preserve">## TaxF         331.9398    45.0717   7.365 6.18e-13 ***</w:t>
+      </w:r>
+      <w:r>
+        <w:br/>
+      </w:r>
+      <w:r>
+        <w:rPr>
+          <w:rStyle w:val="VerbatimChar"/>
+        </w:rPr>
+        <w:t xml:space="preserve">## TaxG         682.9880    56.2501  12.142  &lt; 2e-16 ***</w:t>
       </w:r>
       <w:r>
         <w:br/>
@@ -4058,25 +4058,25 @@
         <w:rPr>
           <w:rStyle w:val="VerbatimChar"/>
         </w:rPr>
-        <w:t xml:space="preserve">## Residual standard error: 172.2 on 553 degrees of freedom</w:t>
-      </w:r>
-      <w:r>
-        <w:br/>
-      </w:r>
-      <w:r>
-        <w:rPr>
-          <w:rStyle w:val="VerbatimChar"/>
-        </w:rPr>
-        <w:t xml:space="preserve">## Multiple R-squared:  0.7863, Adjusted R-squared:  0.7809 </w:t>
-      </w:r>
-      <w:r>
-        <w:br/>
-      </w:r>
-      <w:r>
-        <w:rPr>
-          <w:rStyle w:val="VerbatimChar"/>
-        </w:rPr>
-        <w:t xml:space="preserve">## F-statistic: 145.3 on 14 and 553 DF,  p-value: &lt; 2.2e-16</w:t>
+        <w:t xml:space="preserve">## Residual standard error: 173.7 on 576 degrees of freedom</w:t>
+      </w:r>
+      <w:r>
+        <w:br/>
+      </w:r>
+      <w:r>
+        <w:rPr>
+          <w:rStyle w:val="VerbatimChar"/>
+        </w:rPr>
+        <w:t xml:space="preserve">## Multiple R-squared:  0.7887, Adjusted R-squared:  0.7836 </w:t>
+      </w:r>
+      <w:r>
+        <w:br/>
+      </w:r>
+      <w:r>
+        <w:rPr>
+          <w:rStyle w:val="VerbatimChar"/>
+        </w:rPr>
+        <w:t xml:space="preserve">## F-statistic: 153.6 on 14 and 576 DF,  p-value: &lt; 2.2e-16</w:t>
       </w:r>
     </w:p>
     <w:p>
@@ -4111,7 +4111,7 @@
         <w:t xml:space="preserve">FloorArea</w:t>
       </w:r>
       <w:r>
-        <w:t xml:space="preserve">; the model seems to be predicting that adding an extra 1 square meter to a property only increases the rent by about £0.80. Seems a bit low, right? Do we really think that the difference in Price between a 50 m</w:t>
+        <w:t xml:space="preserve">; the model seems to be predicting that adding an extra 1 square meter to a property only increases the rent by about £1.26. Seems a bit low, right? Do we really think that the difference in Price between a 50 m</w:t>
       </w:r>
       <m:oMath>
         <m:sSup>
@@ -4151,7 +4151,7 @@
         <w:t xml:space="preserve"> </w:t>
       </w:r>
       <w:r>
-        <w:t xml:space="preserve">flat will be just £40.04 extra per month? We’ll come back to this after we run the causal version of this model.</w:t>
+        <w:t xml:space="preserve">flat will be just £62.97 extra per month? We’ll come back to this after we run the causal version of this model.</w:t>
       </w:r>
     </w:p>
     <w:p>
@@ -8110,7 +8110,7 @@
               <a:graphicData uri="http://schemas.openxmlformats.org/drawingml/2006/picture">
                 <pic:pic>
                   <pic:nvPicPr>
-                    <pic:cNvPr descr="Workshop-7---LM-with-multiple-predictors--with-answers-_files/figure-docx/unnamed-chunk-32-1.png" id="72" name="Picture"/>
+                    <pic:cNvPr descr="Workshop-7---LM-with-multiple-predictors--with-answers-_files/figure-docx/unnamed-chunk-31-1.png" id="72" name="Picture"/>
                     <pic:cNvPicPr>
                       <a:picLocks noChangeArrowheads="1" noChangeAspect="1"/>
                     </pic:cNvPicPr>
@@ -8213,15 +8213,200 @@
         <w:pStyle w:val="FirstParagraph"/>
       </w:pPr>
       <w:r>
-        <w:t xml:space="preserve">Most of the diagnostics look ok. Not great, but maybe just about good enough to work with, with the exception of the Residuals vs Leverage plot.</w:t>
-      </w:r>
-    </w:p>
-    <w:p>
-      <w:pPr>
-        <w:pStyle w:val="BodyText"/>
-      </w:pPr>
-      <w:r>
-        <w:t xml:space="preserve">As for the predictive model, decide how you want to deal with the Residuals vs Leverage plot and rerun your analysis if necessary.</w:t>
+        <w:t xml:space="preserve">There are likely some issues that show up in the diagnostics.</w:t>
+      </w:r>
+    </w:p>
+    <w:p>
+      <w:pPr>
+        <w:numPr>
+          <w:ilvl w:val="0"/>
+          <w:numId w:val="1019"/>
+        </w:numPr>
+      </w:pPr>
+      <w:r>
+        <w:t xml:space="preserve">The first is unequal variance of errors. If you think about it, it’s maybe not too surprising for two reasons.</w:t>
+      </w:r>
+    </w:p>
+    <w:p>
+      <w:pPr>
+        <w:numPr>
+          <w:ilvl w:val="1"/>
+          <w:numId w:val="1020"/>
+        </w:numPr>
+      </w:pPr>
+      <w:r>
+        <w:t xml:space="preserve">In your EDA, if you did a histogram of</w:t>
+      </w:r>
+      <w:r>
+        <w:t xml:space="preserve"> </w:t>
+      </w:r>
+      <w:r>
+        <w:rPr>
+          <w:rStyle w:val="VerbatimChar"/>
+        </w:rPr>
+        <w:t xml:space="preserve">Price</w:t>
+      </w:r>
+      <w:r>
+        <w:t xml:space="preserve">, then you may have noticed that rent tends to be rounded to £25-£50 increments when the rent is less than £1000, but when the property is more than £1000, this rounding increases to £50-£100. This creates</w:t>
+      </w:r>
+      <w:r>
+        <w:t xml:space="preserve"> </w:t>
+      </w:r>
+      <w:r>
+        <w:t xml:space="preserve">“</w:t>
+      </w:r>
+      <w:r>
+        <w:t xml:space="preserve">error</w:t>
+      </w:r>
+      <w:r>
+        <w:t xml:space="preserve">”</w:t>
+      </w:r>
+      <w:r>
+        <w:t xml:space="preserve"> </w:t>
+      </w:r>
+      <w:r>
+        <w:t xml:space="preserve">in the price measurement at higher prices, so our model uncertainty performs</w:t>
+      </w:r>
+      <w:r>
+        <w:t xml:space="preserve"> </w:t>
+      </w:r>
+      <w:r>
+        <w:t xml:space="preserve">“</w:t>
+      </w:r>
+      <w:r>
+        <w:t xml:space="preserve">worse</w:t>
+      </w:r>
+      <w:r>
+        <w:t xml:space="preserve">”</w:t>
+      </w:r>
+      <w:r>
+        <w:t xml:space="preserve">.</w:t>
+      </w:r>
+    </w:p>
+    <w:p>
+      <w:pPr>
+        <w:numPr>
+          <w:ilvl w:val="1"/>
+          <w:numId w:val="1020"/>
+        </w:numPr>
+      </w:pPr>
+      <w:r>
+        <w:t xml:space="preserve">Keep in mind that unequal variance of errors impacts our estimated standard error, which in turn impacts our 95% confidence intervals. It does not affect our actual prediction.</w:t>
+      </w:r>
+    </w:p>
+    <w:p>
+      <w:pPr>
+        <w:numPr>
+          <w:ilvl w:val="1"/>
+          <w:numId w:val="1020"/>
+        </w:numPr>
+      </w:pPr>
+      <w:r>
+        <w:t xml:space="preserve">The other reason is that estate agents have a easier time guessing the rent for</w:t>
+      </w:r>
+      <w:r>
+        <w:t xml:space="preserve"> </w:t>
+      </w:r>
+      <w:r>
+        <w:t xml:space="preserve">“</w:t>
+      </w:r>
+      <w:r>
+        <w:t xml:space="preserve">cheap</w:t>
+      </w:r>
+      <w:r>
+        <w:t xml:space="preserve">”</w:t>
+      </w:r>
+      <w:r>
+        <w:t xml:space="preserve"> </w:t>
+      </w:r>
+      <w:r>
+        <w:t xml:space="preserve">properties. For cheap flats, it’s easier to pin down the right rent because £250 is a big chunk of the total (e.g. going from £500 to £750 is a big jump). For a luxury mansion, £250 hardly moves the needle (e.g. going from £3,500 to £3,750), so estimates naturally spread out more as price increases.</w:t>
+      </w:r>
+    </w:p>
+    <w:p>
+      <w:pPr>
+        <w:numPr>
+          <w:ilvl w:val="0"/>
+          <w:numId w:val="1019"/>
+        </w:numPr>
+      </w:pPr>
+      <w:r>
+        <w:t xml:space="preserve">The second issue you might see is that you may have one or multiple overly influential observations. This has fluctuated over time as I’ve added more and more data (sometimes these disappear, other times more appear) but generally there are one or two expensive properties that cause issues and need to be addressed.</w:t>
+      </w:r>
+    </w:p>
+    <w:p>
+      <w:pPr>
+        <w:numPr>
+          <w:ilvl w:val="1"/>
+          <w:numId w:val="1021"/>
+        </w:numPr>
+      </w:pPr>
+      <w:r>
+        <w:t xml:space="preserve">Influential observations do impact the parameter estimates, so you would first want to confirm if the entered</w:t>
+      </w:r>
+      <w:r>
+        <w:t xml:space="preserve"> </w:t>
+      </w:r>
+      <w:r>
+        <w:rPr>
+          <w:rStyle w:val="VerbatimChar"/>
+        </w:rPr>
+        <w:t xml:space="preserve">Price</w:t>
+      </w:r>
+      <w:r>
+        <w:t xml:space="preserve"> </w:t>
+      </w:r>
+      <w:r>
+        <w:t xml:space="preserve">is correct (which you can check given you have</w:t>
+      </w:r>
+      <w:r>
+        <w:t xml:space="preserve"> </w:t>
+      </w:r>
+      <w:r>
+        <w:rPr>
+          <w:rStyle w:val="VerbatimChar"/>
+        </w:rPr>
+        <w:t xml:space="preserve">PropertyURL</w:t>
+      </w:r>
+      <w:r>
+        <w:t xml:space="preserve"> </w:t>
+      </w:r>
+      <w:r>
+        <w:t xml:space="preserve">- but note that ASPC sometimes removes properties)</w:t>
+      </w:r>
+    </w:p>
+    <w:p>
+      <w:pPr>
+        <w:numPr>
+          <w:ilvl w:val="1"/>
+          <w:numId w:val="1021"/>
+        </w:numPr>
+      </w:pPr>
+      <w:r>
+        <w:t xml:space="preserve">If you confirm the</w:t>
+      </w:r>
+      <w:r>
+        <w:t xml:space="preserve"> </w:t>
+      </w:r>
+      <w:r>
+        <w:rPr>
+          <w:rStyle w:val="VerbatimChar"/>
+        </w:rPr>
+        <w:t xml:space="preserve">Price</w:t>
+      </w:r>
+      <w:r>
+        <w:t xml:space="preserve"> </w:t>
+      </w:r>
+      <w:r>
+        <w:t xml:space="preserve">has been recorded properly, then you will need to decide how to resolve. Generally, you have two options, either ignore the problem (but acknowledge it when talking about your results) or remove the observation from your dataset. There are some other options, but we won’t go into them here.</w:t>
+      </w:r>
+    </w:p>
+    <w:p>
+      <w:pPr>
+        <w:pStyle w:val="FirstParagraph"/>
+      </w:pPr>
+      <w:r>
+        <w:t xml:space="preserve">Fix any issues with influential properties, and rerun your analysis.</w:t>
       </w:r>
     </w:p>
     <w:p>
@@ -8349,7 +8534,7 @@
         <w:rPr>
           <w:rStyle w:val="CommentTok"/>
         </w:rPr>
-        <w:t xml:space="preserve"># Diagnostics now look good.</w:t>
+        <w:t xml:space="preserve"># Diagnostics now look good except for unequal variance of errors.</w:t>
       </w:r>
     </w:p>
     <w:bookmarkEnd w:id="73"/>
@@ -8449,7 +8634,7 @@
         <w:rPr>
           <w:rStyle w:val="VerbatimChar"/>
         </w:rPr>
-        <w:t xml:space="preserve">## -941.28  -99.61   -4.94   76.39 1309.06 </w:t>
+        <w:t xml:space="preserve">## -960.59 -102.29   -2.00   80.33 1295.40 </w:t>
       </w:r>
       <w:r>
         <w:br/>
@@ -8485,16 +8670,16 @@
         <w:rPr>
           <w:rStyle w:val="VerbatimChar"/>
         </w:rPr>
-        <w:t xml:space="preserve">## (Intercept) 217.8259    20.8370   10.45   &lt;2e-16 ***</w:t>
-      </w:r>
-      <w:r>
-        <w:br/>
-      </w:r>
-      <w:r>
-        <w:rPr>
-          <w:rStyle w:val="VerbatimChar"/>
-        </w:rPr>
-        <w:t xml:space="preserve">## FloorArea     8.2223     0.2473   33.25   &lt;2e-16 ***</w:t>
+        <w:t xml:space="preserve">## (Intercept) 209.0272    20.1499   10.37   &lt;2e-16 ***</w:t>
+      </w:r>
+      <w:r>
+        <w:br/>
+      </w:r>
+      <w:r>
+        <w:rPr>
+          <w:rStyle w:val="VerbatimChar"/>
+        </w:rPr>
+        <w:t xml:space="preserve">## FloorArea     8.3567     0.2384   35.05   &lt;2e-16 ***</w:t>
       </w:r>
       <w:r>
         <w:br/>
@@ -8530,25 +8715,25 @@
         <w:rPr>
           <w:rStyle w:val="VerbatimChar"/>
         </w:rPr>
-        <w:t xml:space="preserve">## Residual standard error: 216.6 on 567 degrees of freedom</w:t>
-      </w:r>
-      <w:r>
-        <w:br/>
-      </w:r>
-      <w:r>
-        <w:rPr>
-          <w:rStyle w:val="VerbatimChar"/>
-        </w:rPr>
-        <w:t xml:space="preserve">## Multiple R-squared:  0.661,  Adjusted R-squared:  0.6604 </w:t>
-      </w:r>
-      <w:r>
-        <w:br/>
-      </w:r>
-      <w:r>
-        <w:rPr>
-          <w:rStyle w:val="VerbatimChar"/>
-        </w:rPr>
-        <w:t xml:space="preserve">## F-statistic:  1105 on 1 and 567 DF,  p-value: &lt; 2.2e-16</w:t>
+        <w:t xml:space="preserve">## Residual standard error: 215 on 590 degrees of freedom</w:t>
+      </w:r>
+      <w:r>
+        <w:br/>
+      </w:r>
+      <w:r>
+        <w:rPr>
+          <w:rStyle w:val="VerbatimChar"/>
+        </w:rPr>
+        <w:t xml:space="preserve">## Multiple R-squared:  0.6755, Adjusted R-squared:  0.675 </w:t>
+      </w:r>
+      <w:r>
+        <w:br/>
+      </w:r>
+      <w:r>
+        <w:rPr>
+          <w:rStyle w:val="VerbatimChar"/>
+        </w:rPr>
+        <w:t xml:space="preserve">## F-statistic:  1228 on 1 and 590 DF,  p-value: &lt; 2.2e-16</w:t>
       </w:r>
     </w:p>
     <w:p>
@@ -9402,7 +9587,7 @@
         <w:t xml:space="preserve"> </w:t>
       </w:r>
       <w:r>
-        <w:t xml:space="preserve">the rent increases by roughly £7.65 per month. So long as we assume that our DAG is accurate (a potentially big assumption), this £7.65 increase is the</w:t>
+        <w:t xml:space="preserve">the rent increases by roughly £8.36 per month. So long as we assume that our DAG is accurate (a potentially big assumption), this £8.36 increase is the</w:t>
       </w:r>
       <w:r>
         <w:t xml:space="preserve"> </w:t>
@@ -9444,7 +9629,7 @@
         <w:t xml:space="preserve"> </w:t>
       </w:r>
       <w:r>
-        <w:t xml:space="preserve">an extra square meter to a property would increase the rent by £0.80 per month. At the time, we noted that £0.80 seemed on the</w:t>
+        <w:t xml:space="preserve">an extra square meter to a property would increase the rent by £1.26 per month. At the time, we noted that £1.26 seemed on the</w:t>
       </w:r>
       <w:r>
         <w:t xml:space="preserve"> </w:t>
@@ -12129,6 +12314,15 @@
     </w:lvlOverride>
   </w:num>
   <w:num w:numId="1018">
+    <w:abstractNumId w:val="991"/>
+  </w:num>
+  <w:num w:numId="1019">
+    <w:abstractNumId w:val="991"/>
+  </w:num>
+  <w:num w:numId="1020">
+    <w:abstractNumId w:val="991"/>
+  </w:num>
+  <w:num w:numId="1021">
     <w:abstractNumId w:val="991"/>
   </w:num>
 </w:numbering>

</xml_diff>